<commit_message>
feat: render client specsheet as single styled datasheet table
</commit_message>
<xml_diff>
--- a/ACDC charger/400A Charging System Client Specsheet.docx
+++ b/ACDC charger/400A Charging System Client Specsheet.docx
@@ -4,253 +4,77 @@
   <w:body>
     <w:p>
       <w:pPr>
-        <w:rPr>
-          <w:lang w:val="en-US"/>
-        </w:rPr>
+        <w:jc w:val="center"/>
       </w:pPr>
       <w:r>
         <w:rPr>
           <w:b/>
-          <w:lang w:val="en-US"/>
+          <w:color w:val="0F4761"/>
+          <w:sz w:val="40"/>
         </w:rPr>
-        <w:t>400 A Liquid-Cooled DC Charging System — Technical Specification Sheet</w:t>
+        <w:t>400 A Liquid-Cooled DC Charging System</w:t>
       </w:r>
     </w:p>
     <w:p>
       <w:pPr>
-        <w:rPr>
-          <w:lang w:val="en-US"/>
-        </w:rPr>
+        <w:jc w:val="center"/>
       </w:pPr>
       <w:r>
         <w:rPr>
-          <w:lang w:val="en-US"/>
+          <w:b/>
+          <w:color w:val="156082"/>
+          <w:sz w:val="28"/>
         </w:rPr>
-        <w:t>Client-Facing Integrated Product Specification</w:t>
+        <w:t>Technical Specification Sheet</w:t>
       </w:r>
     </w:p>
     <w:p>
       <w:pPr>
-        <w:rPr>
-          <w:lang w:val="en-US"/>
-        </w:rPr>
-      </w:pPr>
-    </w:p>
-    <w:p>
-      <w:pPr>
-        <w:rPr>
-          <w:lang w:val="en-US"/>
-        </w:rPr>
+        <w:jc w:val="center"/>
       </w:pPr>
       <w:r>
         <w:rPr>
-          <w:lang w:val="en-US"/>
+          <w:i/>
+          <w:sz w:val="20"/>
         </w:rPr>
-        <w:t>Version: 1.0</w:t>
+        <w:t>Modular 280 kW integrated DC charging system  ·  Version 1.0  ·  2026-07-16</w:t>
       </w:r>
     </w:p>
     <w:p>
       <w:pPr>
-        <w:rPr>
-          <w:lang w:val="en-US"/>
-        </w:rPr>
-      </w:pPr>
-      <w:r>
-        <w:rPr>
-          <w:lang w:val="en-US"/>
-        </w:rPr>
-        <w:t>Date: 2026-07-16</w:t>
-      </w:r>
-    </w:p>
-    <w:p>
-      <w:pPr>
         <w:pBdr>
           <w:bottom w:val="single" w:sz="6" w:space="1" w:color="4472C4"/>
         </w:pBdr>
-        <w:rPr>
-          <w:lang w:val="en-US"/>
-        </w:rPr>
       </w:pPr>
     </w:p>
     <w:p>
-      <w:pPr>
-        <w:rPr>
-          <w:lang w:val="en-US"/>
-        </w:rPr>
-      </w:pPr>
-    </w:p>
-    <w:p>
-      <w:pPr>
-        <w:pStyle w:val="Kop1"/>
-        <w:rPr>
-          <w:lang w:val="en-US"/>
-        </w:rPr>
-      </w:pPr>
-      <w:r>
-        <w:rPr>
-          <w:lang w:val="en-US"/>
-        </w:rPr>
-        <w:t>System Overview</w:t>
-      </w:r>
-    </w:p>
-    <w:p>
-      <w:pPr>
-        <w:rPr>
-          <w:lang w:val="en-US"/>
-        </w:rPr>
-      </w:pPr>
-      <w:r>
-        <w:rPr>
-          <w:lang w:val="en-US"/>
-        </w:rPr>
-        <w:t xml:space="preserve">A fully integrated, liquid-cooled AC/DC charging system delivering up to </w:t>
-      </w:r>
-      <w:r>
-        <w:rPr>
-          <w:b/>
-          <w:lang w:val="en-US"/>
-        </w:rPr>
-        <w:t>280 kW</w:t>
-      </w:r>
-      <w:r>
-        <w:rPr>
-          <w:lang w:val="en-US"/>
-        </w:rPr>
-        <w:t xml:space="preserve"> of</w:t>
-      </w:r>
-    </w:p>
-    <w:p>
-      <w:pPr>
-        <w:rPr>
-          <w:lang w:val="en-US"/>
-        </w:rPr>
-      </w:pPr>
-      <w:r>
-        <w:rPr>
-          <w:lang w:val="en-US"/>
-        </w:rPr>
-        <w:t xml:space="preserve">continuous DC power with an AC input rated for </w:t>
-      </w:r>
-      <w:r>
-        <w:rPr>
-          <w:b/>
-          <w:lang w:val="en-US"/>
-        </w:rPr>
-        <w:t>400 A</w:t>
-      </w:r>
-      <w:r>
-        <w:rPr>
-          <w:lang w:val="en-US"/>
-        </w:rPr>
-        <w:t xml:space="preserve"> service. The system is built from</w:t>
-      </w:r>
-    </w:p>
-    <w:p>
-      <w:pPr>
-        <w:rPr>
-          <w:lang w:val="en-US"/>
-        </w:rPr>
-      </w:pPr>
-      <w:r>
-        <w:rPr>
-          <w:lang w:val="en-US"/>
-        </w:rPr>
-        <w:t>seven parallel conversion modules operating under unified control, providing high</w:t>
-      </w:r>
-    </w:p>
-    <w:p>
-      <w:pPr>
-        <w:rPr>
-          <w:lang w:val="en-US"/>
-        </w:rPr>
-      </w:pPr>
-      <w:r>
-        <w:rPr>
-          <w:lang w:val="en-US"/>
-        </w:rPr>
-        <w:t xml:space="preserve">efficiency, galvanic isolation, </w:t>
-      </w:r>
-      <w:r>
-        <w:rPr>
-          <w:lang w:val="en-US"/>
-        </w:rPr>
-        <w:t xml:space="preserve">and </w:t>
-      </w:r>
-      <w:r>
-        <w:rPr>
-          <w:lang w:val="en-US"/>
-        </w:rPr>
-        <w:t>redundancy for demanding</w:t>
-      </w:r>
-    </w:p>
-    <w:p>
-      <w:pPr>
-        <w:rPr>
-          <w:lang w:val="en-US"/>
-        </w:rPr>
-      </w:pPr>
-      <w:r>
-        <w:rPr>
-          <w:lang w:val="en-US"/>
-        </w:rPr>
-        <w:t>industrial and mobile battery-container applications.</w:t>
-      </w:r>
-    </w:p>
-    <w:p>
-      <w:pPr>
-        <w:rPr>
-          <w:lang w:val="en-US"/>
-        </w:rPr>
-      </w:pPr>
-    </w:p>
-    <w:p>
-      <w:pPr>
-        <w:rPr>
-          <w:lang w:val="en-US"/>
-        </w:rPr>
-      </w:pPr>
-    </w:p>
-    <w:p>
-      <w:pPr>
-        <w:rPr>
-          <w:rFonts w:asciiTheme="majorHAnsi" w:eastAsiaTheme="majorEastAsia" w:hAnsiTheme="majorHAnsi" w:cstheme="majorBidi"/>
-          <w:color w:val="0F4761" w:themeColor="accent1" w:themeShade="BF"/>
-          <w:sz w:val="40"/>
-          <w:szCs w:val="40"/>
-        </w:rPr>
-      </w:pPr>
-      <w:r>
-        <w:br w:type="page"/>
-      </w:r>
-    </w:p>
-    <w:p>
-      <w:pPr>
-        <w:pStyle w:val="Kop1"/>
-      </w:pPr>
-      <w:r>
-        <w:lastRenderedPageBreak/>
-        <w:t>AC Input</w:t>
-      </w:r>
+      <w:pPr/>
     </w:p>
     <w:tbl>
       <w:tblPr>
         <w:tblStyle w:val="Tabelraster"/>
-        <w:tblW w:w="0" w:type="auto"/>
-        <w:tblLook w:val="04A0" w:firstRow="1" w:lastRow="0" w:firstColumn="1" w:lastColumn="0" w:noHBand="0" w:noVBand="1"/>
+        <w:tblW w:type="auto" w:w="0"/>
+        <w:jc w:val="center"/>
+        <w:tblLayout w:type="fixed"/>
+        <w:tblLook w:firstColumn="1" w:firstRow="1" w:lastColumn="0" w:lastRow="0" w:noHBand="0" w:noVBand="1" w:val="04A0"/>
+        <w:tblLayout w:type="fixed"/>
       </w:tblPr>
       <w:tblGrid>
-        <w:gridCol w:w="4508"/>
-        <w:gridCol w:w="4508"/>
+        <w:gridCol w:w="3685"/>
+        <w:gridCol w:w="5953"/>
       </w:tblGrid>
       <w:tr>
         <w:tc>
           <w:tcPr>
-            <w:tcW w:w="4513" w:type="dxa"/>
+            <w:tcW w:type="dxa" w:w="3685"/>
+            <w:shd w:val="clear" w:color="auto" w:fill="0F4761"/>
           </w:tcPr>
           <w:p>
             <w:r>
               <w:rPr>
                 <w:b/>
+                <w:i w:val="0"/>
+                <w:color w:val="FFFFFF"/>
               </w:rPr>
               <w:t>Parameter</w:t>
             </w:r>
@@ -258,38 +82,36 @@
         </w:tc>
         <w:tc>
           <w:tcPr>
-            <w:tcW w:w="4513" w:type="dxa"/>
-          </w:tcPr>
-          <w:p>
-            <w:proofErr w:type="spellStart"/>
+            <w:tcW w:type="dxa" w:w="5953"/>
+            <w:shd w:val="clear" w:color="auto" w:fill="0F4761"/>
+          </w:tcPr>
+          <w:p>
             <w:r>
               <w:rPr>
                 <w:b/>
+                <w:i w:val="0"/>
+                <w:color w:val="FFFFFF"/>
               </w:rPr>
               <w:t>Specification</w:t>
             </w:r>
-            <w:proofErr w:type="spellEnd"/>
           </w:p>
         </w:tc>
       </w:tr>
       <w:tr>
         <w:tc>
           <w:tcPr>
-            <w:tcW w:w="4513" w:type="dxa"/>
-          </w:tcPr>
-          <w:p>
-            <w:r>
-              <w:t>Input voltage range</w:t>
-            </w:r>
-          </w:p>
-        </w:tc>
-        <w:tc>
-          <w:tcPr>
-            <w:tcW w:w="4513" w:type="dxa"/>
-          </w:tcPr>
-          <w:p>
-            <w:r>
-              <w:t>260 - 530 VAC, 3-phase</w:t>
+            <w:tcW w:type="dxa" w:w="5953"/>
+            <w:gridSpan w:val="2"/>
+            <w:shd w:val="clear" w:color="auto" w:fill="156082"/>
+          </w:tcPr>
+          <w:p>
+            <w:r>
+              <w:rPr>
+                <w:b/>
+                <w:i w:val="0"/>
+                <w:color w:val="FFFFFF"/>
+              </w:rPr>
+              <w:t>1.  System Overview</w:t>
             </w:r>
           </w:p>
         </w:tc>
@@ -297,26 +119,42 @@
       <w:tr>
         <w:tc>
           <w:tcPr>
-            <w:tcW w:w="4513" w:type="dxa"/>
-          </w:tcPr>
-          <w:p>
-            <w:r>
-              <w:t xml:space="preserve">Input </w:t>
-            </w:r>
-            <w:proofErr w:type="spellStart"/>
-            <w:r>
-              <w:t>frequency</w:t>
-            </w:r>
-            <w:proofErr w:type="spellEnd"/>
-          </w:p>
-        </w:tc>
-        <w:tc>
-          <w:tcPr>
-            <w:tcW w:w="4513" w:type="dxa"/>
-          </w:tcPr>
-          <w:p>
-            <w:r>
-              <w:t>50 / 60 Hz</w:t>
+            <w:tcW w:type="dxa" w:w="5953"/>
+            <w:gridSpan w:val="2"/>
+          </w:tcPr>
+          <w:p>
+            <w:r>
+              <w:rPr>
+                <w:b w:val="0"/>
+                <w:i w:val="0"/>
+              </w:rPr>
+              <w:t xml:space="preserve">A fully integrated, liquid-cooled AC/DC charging system delivering up to </w:t>
+            </w:r>
+            <w:r>
+              <w:rPr>
+                <w:b/>
+              </w:rPr>
+              <w:t>280 kW</w:t>
+            </w:r>
+            <w:r>
+              <w:rPr>
+                <w:b w:val="0"/>
+                <w:i w:val="0"/>
+              </w:rPr>
+              <w:t xml:space="preserve"> of continuous DC power with an AC input rated for </w:t>
+            </w:r>
+            <w:r>
+              <w:rPr>
+                <w:b/>
+              </w:rPr>
+              <w:t>400 A</w:t>
+            </w:r>
+            <w:r>
+              <w:rPr>
+                <w:b w:val="0"/>
+                <w:i w:val="0"/>
+              </w:rPr>
+              <w:t xml:space="preserve"> service. The system is built from seven parallel conversion modules operating under unified control, providing high efficiency, galvanic isolation, redundancy, and hot-swap serviceability for demanding industrial and mobile battery-container applications.</w:t>
             </w:r>
           </w:p>
         </w:tc>
@@ -324,42 +162,18 @@
       <w:tr>
         <w:tc>
           <w:tcPr>
-            <w:tcW w:w="4513" w:type="dxa"/>
-          </w:tcPr>
-          <w:p>
-            <w:proofErr w:type="spellStart"/>
-            <w:r>
-              <w:t>Rated</w:t>
-            </w:r>
-            <w:proofErr w:type="spellEnd"/>
-            <w:r>
-              <w:t xml:space="preserve"> input </w:t>
-            </w:r>
-            <w:proofErr w:type="spellStart"/>
-            <w:r>
-              <w:t>current</w:t>
-            </w:r>
-            <w:proofErr w:type="spellEnd"/>
-            <w:r>
-              <w:t xml:space="preserve"> (</w:t>
-            </w:r>
-            <w:proofErr w:type="spellStart"/>
-            <w:r>
-              <w:t>nominal</w:t>
-            </w:r>
-            <w:proofErr w:type="spellEnd"/>
-            <w:r>
-              <w:t>)</w:t>
-            </w:r>
-          </w:p>
-        </w:tc>
-        <w:tc>
-          <w:tcPr>
-            <w:tcW w:w="4513" w:type="dxa"/>
-          </w:tcPr>
-          <w:p>
-            <w:r>
-              <w:t>~= 420 A</w:t>
+            <w:tcW w:type="dxa" w:w="5953"/>
+            <w:gridSpan w:val="2"/>
+            <w:shd w:val="clear" w:color="auto" w:fill="156082"/>
+          </w:tcPr>
+          <w:p>
+            <w:r>
+              <w:rPr>
+                <w:b/>
+                <w:i w:val="0"/>
+                <w:color w:val="FFFFFF"/>
+              </w:rPr>
+              <w:t>2.  AC Input</w:t>
             </w:r>
           </w:p>
         </w:tc>
@@ -367,26 +181,29 @@
       <w:tr>
         <w:tc>
           <w:tcPr>
-            <w:tcW w:w="4513" w:type="dxa"/>
-          </w:tcPr>
-          <w:p>
-            <w:r>
-              <w:t xml:space="preserve">Maximum input </w:t>
-            </w:r>
-            <w:proofErr w:type="spellStart"/>
-            <w:r>
-              <w:t>current</w:t>
-            </w:r>
-            <w:proofErr w:type="spellEnd"/>
-          </w:p>
-        </w:tc>
-        <w:tc>
-          <w:tcPr>
-            <w:tcW w:w="4513" w:type="dxa"/>
-          </w:tcPr>
-          <w:p>
-            <w:r>
-              <w:t>&lt; 532 A</w:t>
+            <w:tcW w:type="dxa" w:w="3685"/>
+          </w:tcPr>
+          <w:p>
+            <w:r>
+              <w:rPr>
+                <w:b/>
+                <w:i w:val="0"/>
+              </w:rPr>
+              <w:t>Input voltage range</w:t>
+            </w:r>
+          </w:p>
+        </w:tc>
+        <w:tc>
+          <w:tcPr>
+            <w:tcW w:type="dxa" w:w="5953"/>
+          </w:tcPr>
+          <w:p>
+            <w:r>
+              <w:rPr>
+                <w:b w:val="0"/>
+                <w:i w:val="0"/>
+              </w:rPr>
+              <w:t>260 - 530 VAC, 3-phase</w:t>
             </w:r>
           </w:p>
         </w:tc>
@@ -394,29 +211,31 @@
       <w:tr>
         <w:tc>
           <w:tcPr>
-            <w:tcW w:w="4513" w:type="dxa"/>
-          </w:tcPr>
-          <w:p>
-            <w:r>
-              <w:t>Power factor</w:t>
-            </w:r>
-          </w:p>
-        </w:tc>
-        <w:tc>
-          <w:tcPr>
-            <w:tcW w:w="4513" w:type="dxa"/>
-          </w:tcPr>
-          <w:p>
-            <w:r>
-              <w:t xml:space="preserve">&gt;= 0.99 at </w:t>
-            </w:r>
-            <w:proofErr w:type="spellStart"/>
-            <w:r>
-              <w:t>rated</w:t>
-            </w:r>
-            <w:proofErr w:type="spellEnd"/>
-            <w:r>
-              <w:t xml:space="preserve"> load</w:t>
+            <w:tcW w:type="dxa" w:w="3685"/>
+            <w:shd w:val="clear" w:color="auto" w:fill="E7EEF2"/>
+          </w:tcPr>
+          <w:p>
+            <w:r>
+              <w:rPr>
+                <w:b/>
+                <w:i w:val="0"/>
+              </w:rPr>
+              <w:t>Input frequency</w:t>
+            </w:r>
+          </w:p>
+        </w:tc>
+        <w:tc>
+          <w:tcPr>
+            <w:tcW w:type="dxa" w:w="5953"/>
+            <w:shd w:val="clear" w:color="auto" w:fill="E7EEF2"/>
+          </w:tcPr>
+          <w:p>
+            <w:r>
+              <w:rPr>
+                <w:b w:val="0"/>
+                <w:i w:val="0"/>
+              </w:rPr>
+              <w:t>50 / 60 Hz</w:t>
             </w:r>
           </w:p>
         </w:tc>
@@ -424,45 +243,29 @@
       <w:tr>
         <w:tc>
           <w:tcPr>
-            <w:tcW w:w="4513" w:type="dxa"/>
-          </w:tcPr>
-          <w:p>
-            <w:r>
-              <w:t xml:space="preserve">Total </w:t>
-            </w:r>
-            <w:proofErr w:type="spellStart"/>
-            <w:r>
-              <w:t>harmonic</w:t>
-            </w:r>
-            <w:proofErr w:type="spellEnd"/>
-            <w:r>
-              <w:t xml:space="preserve"> </w:t>
-            </w:r>
-            <w:proofErr w:type="spellStart"/>
-            <w:r>
-              <w:t>distortion</w:t>
-            </w:r>
-            <w:proofErr w:type="spellEnd"/>
-            <w:r>
-              <w:t xml:space="preserve"> (</w:t>
-            </w:r>
-            <w:proofErr w:type="spellStart"/>
-            <w:r>
-              <w:t>THDi</w:t>
-            </w:r>
-            <w:proofErr w:type="spellEnd"/>
-            <w:r>
-              <w:t>)</w:t>
-            </w:r>
-          </w:p>
-        </w:tc>
-        <w:tc>
-          <w:tcPr>
-            <w:tcW w:w="4513" w:type="dxa"/>
-          </w:tcPr>
-          <w:p>
-            <w:r>
-              <w:t>&lt; 5 %</w:t>
+            <w:tcW w:type="dxa" w:w="3685"/>
+          </w:tcPr>
+          <w:p>
+            <w:r>
+              <w:rPr>
+                <w:b/>
+                <w:i w:val="0"/>
+              </w:rPr>
+              <w:t>Rated input current (nominal)</w:t>
+            </w:r>
+          </w:p>
+        </w:tc>
+        <w:tc>
+          <w:tcPr>
+            <w:tcW w:type="dxa" w:w="5953"/>
+          </w:tcPr>
+          <w:p>
+            <w:r>
+              <w:rPr>
+                <w:b w:val="0"/>
+                <w:i w:val="0"/>
+              </w:rPr>
+              <w:t>~= 420 A</w:t>
             </w:r>
           </w:p>
         </w:tc>
@@ -470,48 +273,31 @@
       <w:tr>
         <w:tc>
           <w:tcPr>
-            <w:tcW w:w="4513" w:type="dxa"/>
-          </w:tcPr>
-          <w:p>
-            <w:r>
-              <w:t xml:space="preserve">AC </w:t>
-            </w:r>
-            <w:proofErr w:type="spellStart"/>
-            <w:r>
-              <w:t>connection</w:t>
-            </w:r>
-            <w:proofErr w:type="spellEnd"/>
-          </w:p>
-        </w:tc>
-        <w:tc>
-          <w:tcPr>
-            <w:tcW w:w="4513" w:type="dxa"/>
-          </w:tcPr>
-          <w:p>
-            <w:pPr>
-              <w:rPr>
-                <w:lang w:val="en-US"/>
-              </w:rPr>
-            </w:pPr>
-            <w:r>
-              <w:rPr>
-                <w:lang w:val="en-US"/>
-              </w:rPr>
-              <w:t xml:space="preserve">400 / 500 A </w:t>
-            </w:r>
-            <w:proofErr w:type="spellStart"/>
-            <w:r>
-              <w:rPr>
-                <w:lang w:val="en-US"/>
-              </w:rPr>
-              <w:t>Powerlock</w:t>
-            </w:r>
-            <w:proofErr w:type="spellEnd"/>
-            <w:r>
-              <w:rPr>
-                <w:lang w:val="en-US"/>
-              </w:rPr>
-              <w:t xml:space="preserve"> set (3P + PE)</w:t>
+            <w:tcW w:type="dxa" w:w="3685"/>
+            <w:shd w:val="clear" w:color="auto" w:fill="E7EEF2"/>
+          </w:tcPr>
+          <w:p>
+            <w:r>
+              <w:rPr>
+                <w:b/>
+                <w:i w:val="0"/>
+              </w:rPr>
+              <w:t>Maximum input current</w:t>
+            </w:r>
+          </w:p>
+        </w:tc>
+        <w:tc>
+          <w:tcPr>
+            <w:tcW w:type="dxa" w:w="5953"/>
+            <w:shd w:val="clear" w:color="auto" w:fill="E7EEF2"/>
+          </w:tcPr>
+          <w:p>
+            <w:r>
+              <w:rPr>
+                <w:b w:val="0"/>
+                <w:i w:val="0"/>
+              </w:rPr>
+              <w:t>&lt; 532 A</w:t>
             </w:r>
           </w:p>
         </w:tc>
@@ -519,1619 +305,1401 @@
       <w:tr>
         <w:tc>
           <w:tcPr>
-            <w:tcW w:w="4513" w:type="dxa"/>
-          </w:tcPr>
-          <w:p>
-            <w:proofErr w:type="spellStart"/>
-            <w:r>
-              <w:t>Inrush</w:t>
-            </w:r>
-            <w:proofErr w:type="spellEnd"/>
-            <w:r>
-              <w:t xml:space="preserve"> </w:t>
-            </w:r>
-            <w:proofErr w:type="spellStart"/>
-            <w:r>
-              <w:t>behaviour</w:t>
-            </w:r>
-            <w:proofErr w:type="spellEnd"/>
-          </w:p>
-        </w:tc>
-        <w:tc>
-          <w:tcPr>
-            <w:tcW w:w="4513" w:type="dxa"/>
-          </w:tcPr>
-          <w:p>
-            <w:pPr>
-              <w:rPr>
-                <w:lang w:val="en-US"/>
-              </w:rPr>
-            </w:pPr>
-            <w:r>
-              <w:rPr>
-                <w:lang w:val="en-US"/>
+            <w:tcW w:type="dxa" w:w="3685"/>
+          </w:tcPr>
+          <w:p>
+            <w:r>
+              <w:rPr>
+                <w:b/>
+                <w:i w:val="0"/>
+              </w:rPr>
+              <w:t>Power factor</w:t>
+            </w:r>
+          </w:p>
+        </w:tc>
+        <w:tc>
+          <w:tcPr>
+            <w:tcW w:type="dxa" w:w="5953"/>
+          </w:tcPr>
+          <w:p>
+            <w:r>
+              <w:rPr>
+                <w:b w:val="0"/>
+                <w:i w:val="0"/>
+              </w:rPr>
+              <w:t>&gt;= 0.99 at rated load</w:t>
+            </w:r>
+          </w:p>
+        </w:tc>
+      </w:tr>
+      <w:tr>
+        <w:tc>
+          <w:tcPr>
+            <w:tcW w:type="dxa" w:w="3685"/>
+            <w:shd w:val="clear" w:color="auto" w:fill="E7EEF2"/>
+          </w:tcPr>
+          <w:p>
+            <w:r>
+              <w:rPr>
+                <w:b/>
+                <w:i w:val="0"/>
+              </w:rPr>
+              <w:t>Total harmonic distortion (THDi)</w:t>
+            </w:r>
+          </w:p>
+        </w:tc>
+        <w:tc>
+          <w:tcPr>
+            <w:tcW w:type="dxa" w:w="5953"/>
+            <w:shd w:val="clear" w:color="auto" w:fill="E7EEF2"/>
+          </w:tcPr>
+          <w:p>
+            <w:r>
+              <w:rPr>
+                <w:b w:val="0"/>
+                <w:i w:val="0"/>
+              </w:rPr>
+              <w:t>&lt; 5 %</w:t>
+            </w:r>
+          </w:p>
+        </w:tc>
+      </w:tr>
+      <w:tr>
+        <w:tc>
+          <w:tcPr>
+            <w:tcW w:type="dxa" w:w="3685"/>
+          </w:tcPr>
+          <w:p>
+            <w:r>
+              <w:rPr>
+                <w:b/>
+                <w:i w:val="0"/>
+              </w:rPr>
+              <w:t>AC connection</w:t>
+            </w:r>
+          </w:p>
+        </w:tc>
+        <w:tc>
+          <w:tcPr>
+            <w:tcW w:type="dxa" w:w="5953"/>
+          </w:tcPr>
+          <w:p>
+            <w:r>
+              <w:rPr>
+                <w:b w:val="0"/>
+                <w:i w:val="0"/>
+              </w:rPr>
+              <w:t>400 / 500 A Powerlock set (3P + PE)</w:t>
+            </w:r>
+          </w:p>
+        </w:tc>
+      </w:tr>
+      <w:tr>
+        <w:tc>
+          <w:tcPr>
+            <w:tcW w:type="dxa" w:w="3685"/>
+            <w:shd w:val="clear" w:color="auto" w:fill="E7EEF2"/>
+          </w:tcPr>
+          <w:p>
+            <w:r>
+              <w:rPr>
+                <w:b/>
+                <w:i w:val="0"/>
+              </w:rPr>
+              <w:t>Inrush behaviour</w:t>
+            </w:r>
+          </w:p>
+        </w:tc>
+        <w:tc>
+          <w:tcPr>
+            <w:tcW w:type="dxa" w:w="5953"/>
+            <w:shd w:val="clear" w:color="auto" w:fill="E7EEF2"/>
+          </w:tcPr>
+          <w:p>
+            <w:r>
+              <w:rPr>
+                <w:b w:val="0"/>
+                <w:i w:val="0"/>
               </w:rPr>
               <w:t>Compatible with C-type breaker (C80)</w:t>
+            </w:r>
+          </w:p>
+        </w:tc>
+      </w:tr>
+      <w:tr>
+        <w:tc>
+          <w:tcPr>
+            <w:tcW w:type="dxa" w:w="5953"/>
+            <w:gridSpan w:val="2"/>
+            <w:shd w:val="clear" w:color="auto" w:fill="156082"/>
+          </w:tcPr>
+          <w:p>
+            <w:r>
+              <w:rPr>
+                <w:b/>
+                <w:i w:val="0"/>
+                <w:color w:val="FFFFFF"/>
+              </w:rPr>
+              <w:t>3.  DC Output</w:t>
+            </w:r>
+          </w:p>
+        </w:tc>
+      </w:tr>
+      <w:tr>
+        <w:tc>
+          <w:tcPr>
+            <w:tcW w:type="dxa" w:w="3685"/>
+          </w:tcPr>
+          <w:p>
+            <w:r>
+              <w:rPr>
+                <w:b/>
+                <w:i w:val="0"/>
+              </w:rPr>
+              <w:t>Output voltage range</w:t>
+            </w:r>
+          </w:p>
+        </w:tc>
+        <w:tc>
+          <w:tcPr>
+            <w:tcW w:type="dxa" w:w="5953"/>
+          </w:tcPr>
+          <w:p>
+            <w:r>
+              <w:rPr>
+                <w:b w:val="0"/>
+                <w:i w:val="0"/>
+              </w:rPr>
+              <w:t>150 - 1000 VDC</w:t>
+            </w:r>
+          </w:p>
+        </w:tc>
+      </w:tr>
+      <w:tr>
+        <w:tc>
+          <w:tcPr>
+            <w:tcW w:type="dxa" w:w="3685"/>
+            <w:shd w:val="clear" w:color="auto" w:fill="E7EEF2"/>
+          </w:tcPr>
+          <w:p>
+            <w:r>
+              <w:rPr>
+                <w:b/>
+                <w:i w:val="0"/>
+              </w:rPr>
+              <w:t>Recommended operating window</w:t>
+            </w:r>
+          </w:p>
+        </w:tc>
+        <w:tc>
+          <w:tcPr>
+            <w:tcW w:type="dxa" w:w="5953"/>
+            <w:shd w:val="clear" w:color="auto" w:fill="E7EEF2"/>
+          </w:tcPr>
+          <w:p>
+            <w:r>
+              <w:rPr>
+                <w:b w:val="0"/>
+                <w:i w:val="0"/>
+              </w:rPr>
+              <w:t>600 - 800 VDC</w:t>
+            </w:r>
+          </w:p>
+        </w:tc>
+      </w:tr>
+      <w:tr>
+        <w:tc>
+          <w:tcPr>
+            <w:tcW w:type="dxa" w:w="3685"/>
+          </w:tcPr>
+          <w:p>
+            <w:r>
+              <w:rPr>
+                <w:b/>
+                <w:i w:val="0"/>
+              </w:rPr>
+              <w:t>Rated output power</w:t>
+            </w:r>
+          </w:p>
+        </w:tc>
+        <w:tc>
+          <w:tcPr>
+            <w:tcW w:type="dxa" w:w="5953"/>
+          </w:tcPr>
+          <w:p>
+            <w:r>
+              <w:rPr>
+                <w:b w:val="0"/>
+                <w:i w:val="0"/>
+              </w:rPr>
+              <w:t>280 kW (continuous)</w:t>
+            </w:r>
+          </w:p>
+        </w:tc>
+      </w:tr>
+      <w:tr>
+        <w:tc>
+          <w:tcPr>
+            <w:tcW w:type="dxa" w:w="3685"/>
+            <w:shd w:val="clear" w:color="auto" w:fill="E7EEF2"/>
+          </w:tcPr>
+          <w:p>
+            <w:r>
+              <w:rPr>
+                <w:b/>
+                <w:i w:val="0"/>
+              </w:rPr>
+              <w:t>Rated output current</w:t>
+            </w:r>
+          </w:p>
+        </w:tc>
+        <w:tc>
+          <w:tcPr>
+            <w:tcW w:type="dxa" w:w="5953"/>
+            <w:shd w:val="clear" w:color="auto" w:fill="E7EEF2"/>
+          </w:tcPr>
+          <w:p>
+            <w:r>
+              <w:rPr>
+                <w:b w:val="0"/>
+                <w:i w:val="0"/>
+              </w:rPr>
+              <w:t>280 A</w:t>
+            </w:r>
+          </w:p>
+        </w:tc>
+      </w:tr>
+      <w:tr>
+        <w:tc>
+          <w:tcPr>
+            <w:tcW w:type="dxa" w:w="3685"/>
+          </w:tcPr>
+          <w:p>
+            <w:r>
+              <w:rPr>
+                <w:b/>
+                <w:i w:val="0"/>
+              </w:rPr>
+              <w:t>Maximum output current (constant-power region)</w:t>
+            </w:r>
+          </w:p>
+        </w:tc>
+        <w:tc>
+          <w:tcPr>
+            <w:tcW w:type="dxa" w:w="5953"/>
+          </w:tcPr>
+          <w:p>
+            <w:r>
+              <w:rPr>
+                <w:b w:val="0"/>
+                <w:i w:val="0"/>
+              </w:rPr>
+              <w:t>up to 933 A</w:t>
+            </w:r>
+          </w:p>
+        </w:tc>
+      </w:tr>
+      <w:tr>
+        <w:tc>
+          <w:tcPr>
+            <w:tcW w:type="dxa" w:w="3685"/>
+            <w:shd w:val="clear" w:color="auto" w:fill="E7EEF2"/>
+          </w:tcPr>
+          <w:p>
+            <w:r>
+              <w:rPr>
+                <w:b/>
+                <w:i w:val="0"/>
+              </w:rPr>
+              <w:t>Voltage stabilization accuracy</w:t>
+            </w:r>
+          </w:p>
+        </w:tc>
+        <w:tc>
+          <w:tcPr>
+            <w:tcW w:type="dxa" w:w="5953"/>
+            <w:shd w:val="clear" w:color="auto" w:fill="E7EEF2"/>
+          </w:tcPr>
+          <w:p>
+            <w:r>
+              <w:rPr>
+                <w:b w:val="0"/>
+                <w:i w:val="0"/>
+              </w:rPr>
+              <w:t>&lt;= +/-0.5 %</w:t>
+            </w:r>
+          </w:p>
+        </w:tc>
+      </w:tr>
+      <w:tr>
+        <w:tc>
+          <w:tcPr>
+            <w:tcW w:type="dxa" w:w="3685"/>
+          </w:tcPr>
+          <w:p>
+            <w:r>
+              <w:rPr>
+                <w:b/>
+                <w:i w:val="0"/>
+              </w:rPr>
+              <w:t>Current stabilization accuracy</w:t>
+            </w:r>
+          </w:p>
+        </w:tc>
+        <w:tc>
+          <w:tcPr>
+            <w:tcW w:type="dxa" w:w="5953"/>
+          </w:tcPr>
+          <w:p>
+            <w:r>
+              <w:rPr>
+                <w:b w:val="0"/>
+                <w:i w:val="0"/>
+              </w:rPr>
+              <w:t>&lt;= +/-1 %</w:t>
+            </w:r>
+          </w:p>
+        </w:tc>
+      </w:tr>
+      <w:tr>
+        <w:tc>
+          <w:tcPr>
+            <w:tcW w:type="dxa" w:w="3685"/>
+            <w:shd w:val="clear" w:color="auto" w:fill="E7EEF2"/>
+          </w:tcPr>
+          <w:p>
+            <w:r>
+              <w:rPr>
+                <w:b/>
+                <w:i w:val="0"/>
+              </w:rPr>
+              <w:t>Voltage set-point error</w:t>
+            </w:r>
+          </w:p>
+        </w:tc>
+        <w:tc>
+          <w:tcPr>
+            <w:tcW w:type="dxa" w:w="5953"/>
+            <w:shd w:val="clear" w:color="auto" w:fill="E7EEF2"/>
+          </w:tcPr>
+          <w:p>
+            <w:r>
+              <w:rPr>
+                <w:b w:val="0"/>
+                <w:i w:val="0"/>
+              </w:rPr>
+              <w:t>&lt;= +/-0.5 %</w:t>
+            </w:r>
+          </w:p>
+        </w:tc>
+      </w:tr>
+      <w:tr>
+        <w:tc>
+          <w:tcPr>
+            <w:tcW w:type="dxa" w:w="3685"/>
+          </w:tcPr>
+          <w:p>
+            <w:r>
+              <w:rPr>
+                <w:b/>
+                <w:i w:val="0"/>
+              </w:rPr>
+              <w:t>Power flow</w:t>
+            </w:r>
+          </w:p>
+        </w:tc>
+        <w:tc>
+          <w:tcPr>
+            <w:tcW w:type="dxa" w:w="5953"/>
+          </w:tcPr>
+          <w:p>
+            <w:r>
+              <w:rPr>
+                <w:b w:val="0"/>
+                <w:i w:val="0"/>
+              </w:rPr>
+              <w:t>Unidirectional</w:t>
+            </w:r>
+          </w:p>
+        </w:tc>
+      </w:tr>
+      <w:tr>
+        <w:tc>
+          <w:tcPr>
+            <w:tcW w:type="dxa" w:w="3685"/>
+            <w:shd w:val="clear" w:color="auto" w:fill="E7EEF2"/>
+          </w:tcPr>
+          <w:p>
+            <w:r>
+              <w:rPr>
+                <w:b/>
+                <w:i w:val="0"/>
+              </w:rPr>
+              <w:t>Isolation</w:t>
+            </w:r>
+          </w:p>
+        </w:tc>
+        <w:tc>
+          <w:tcPr>
+            <w:tcW w:type="dxa" w:w="5953"/>
+            <w:shd w:val="clear" w:color="auto" w:fill="E7EEF2"/>
+          </w:tcPr>
+          <w:p>
+            <w:r>
+              <w:rPr>
+                <w:b w:val="0"/>
+                <w:i w:val="0"/>
+              </w:rPr>
+              <w:t>Galvanic isolation between AC and DC</w:t>
+            </w:r>
+          </w:p>
+        </w:tc>
+      </w:tr>
+      <w:tr>
+        <w:tc>
+          <w:tcPr>
+            <w:tcW w:type="dxa" w:w="5953"/>
+            <w:gridSpan w:val="2"/>
+            <w:shd w:val="clear" w:color="auto" w:fill="156082"/>
+          </w:tcPr>
+          <w:p>
+            <w:r>
+              <w:rPr>
+                <w:b/>
+                <w:i w:val="0"/>
+                <w:color w:val="FFFFFF"/>
+              </w:rPr>
+              <w:t>4.  Performance &amp; Efficiency</w:t>
+            </w:r>
+          </w:p>
+        </w:tc>
+      </w:tr>
+      <w:tr>
+        <w:tc>
+          <w:tcPr>
+            <w:tcW w:type="dxa" w:w="3685"/>
+          </w:tcPr>
+          <w:p>
+            <w:r>
+              <w:rPr>
+                <w:b/>
+                <w:i w:val="0"/>
+              </w:rPr>
+              <w:t>Peak efficiency</w:t>
+            </w:r>
+          </w:p>
+        </w:tc>
+        <w:tc>
+          <w:tcPr>
+            <w:tcW w:type="dxa" w:w="5953"/>
+          </w:tcPr>
+          <w:p>
+            <w:r>
+              <w:rPr>
+                <w:b w:val="0"/>
+                <w:i w:val="0"/>
+              </w:rPr>
+              <w:t>&gt; 97 %</w:t>
+            </w:r>
+          </w:p>
+        </w:tc>
+      </w:tr>
+      <w:tr>
+        <w:tc>
+          <w:tcPr>
+            <w:tcW w:type="dxa" w:w="3685"/>
+            <w:shd w:val="clear" w:color="auto" w:fill="E7EEF2"/>
+          </w:tcPr>
+          <w:p>
+            <w:r>
+              <w:rPr>
+                <w:b/>
+                <w:i w:val="0"/>
+              </w:rPr>
+              <w:t>Standby power consumption</w:t>
+            </w:r>
+          </w:p>
+        </w:tc>
+        <w:tc>
+          <w:tcPr>
+            <w:tcW w:type="dxa" w:w="5953"/>
+            <w:shd w:val="clear" w:color="auto" w:fill="E7EEF2"/>
+          </w:tcPr>
+          <w:p>
+            <w:r>
+              <w:rPr>
+                <w:b w:val="0"/>
+                <w:i w:val="0"/>
+              </w:rPr>
+              <w:t>&lt; 70 W (system)</w:t>
+            </w:r>
+          </w:p>
+        </w:tc>
+      </w:tr>
+      <w:tr>
+        <w:tc>
+          <w:tcPr>
+            <w:tcW w:type="dxa" w:w="3685"/>
+          </w:tcPr>
+          <w:p>
+            <w:r>
+              <w:rPr>
+                <w:b/>
+                <w:i w:val="0"/>
+              </w:rPr>
+              <w:t>Minimum settable power</w:t>
+            </w:r>
+          </w:p>
+        </w:tc>
+        <w:tc>
+          <w:tcPr>
+            <w:tcW w:type="dxa" w:w="5953"/>
+          </w:tcPr>
+          <w:p>
+            <w:r>
+              <w:rPr>
+                <w:b w:val="0"/>
+                <w:i w:val="0"/>
+              </w:rPr>
+              <w:t>&gt;= 55 kW / 80 A</w:t>
+            </w:r>
+          </w:p>
+        </w:tc>
+      </w:tr>
+      <w:tr>
+        <w:tc>
+          <w:tcPr>
+            <w:tcW w:type="dxa" w:w="3685"/>
+            <w:shd w:val="clear" w:color="auto" w:fill="E7EEF2"/>
+          </w:tcPr>
+          <w:p>
+            <w:r>
+              <w:rPr>
+                <w:b/>
+                <w:i w:val="0"/>
+              </w:rPr>
+              <w:t>Power resolution</w:t>
+            </w:r>
+          </w:p>
+        </w:tc>
+        <w:tc>
+          <w:tcPr>
+            <w:tcW w:type="dxa" w:w="5953"/>
+            <w:shd w:val="clear" w:color="auto" w:fill="E7EEF2"/>
+          </w:tcPr>
+          <w:p>
+            <w:r>
+              <w:rPr>
+                <w:b w:val="0"/>
+                <w:i w:val="0"/>
+              </w:rPr>
+              <w:t>Modular steps of 40 kW</w:t>
+            </w:r>
+          </w:p>
+        </w:tc>
+      </w:tr>
+      <w:tr>
+        <w:tc>
+          <w:tcPr>
+            <w:tcW w:type="dxa" w:w="3685"/>
+          </w:tcPr>
+          <w:p>
+            <w:r>
+              <w:rPr>
+                <w:b/>
+                <w:i w:val="0"/>
+              </w:rPr>
+              <w:t>Redundancy</w:t>
+            </w:r>
+          </w:p>
+        </w:tc>
+        <w:tc>
+          <w:tcPr>
+            <w:tcW w:type="dxa" w:w="5953"/>
+          </w:tcPr>
+          <w:p>
+            <w:r>
+              <w:rPr>
+                <w:b w:val="0"/>
+                <w:i w:val="0"/>
+              </w:rPr>
+              <w:t>N+1 capable (module-level)</w:t>
+            </w:r>
+          </w:p>
+        </w:tc>
+      </w:tr>
+      <w:tr>
+        <w:tc>
+          <w:tcPr>
+            <w:tcW w:type="dxa" w:w="5953"/>
+            <w:gridSpan w:val="2"/>
+            <w:shd w:val="clear" w:color="auto" w:fill="156082"/>
+          </w:tcPr>
+          <w:p>
+            <w:r>
+              <w:rPr>
+                <w:b/>
+                <w:i w:val="0"/>
+                <w:color w:val="FFFFFF"/>
+              </w:rPr>
+              <w:t>5.  Cooling System</w:t>
+            </w:r>
+          </w:p>
+        </w:tc>
+      </w:tr>
+      <w:tr>
+        <w:tc>
+          <w:tcPr>
+            <w:tcW w:type="dxa" w:w="3685"/>
+          </w:tcPr>
+          <w:p>
+            <w:r>
+              <w:rPr>
+                <w:b/>
+                <w:i w:val="0"/>
+              </w:rPr>
+              <w:t>Cooling method</w:t>
+            </w:r>
+          </w:p>
+        </w:tc>
+        <w:tc>
+          <w:tcPr>
+            <w:tcW w:type="dxa" w:w="5953"/>
+          </w:tcPr>
+          <w:p>
+            <w:r>
+              <w:rPr>
+                <w:b w:val="0"/>
+                <w:i w:val="0"/>
+              </w:rPr>
+              <w:t>Liquid (closed loop)</w:t>
+            </w:r>
+          </w:p>
+        </w:tc>
+      </w:tr>
+      <w:tr>
+        <w:tc>
+          <w:tcPr>
+            <w:tcW w:type="dxa" w:w="3685"/>
+            <w:shd w:val="clear" w:color="auto" w:fill="E7EEF2"/>
+          </w:tcPr>
+          <w:p>
+            <w:r>
+              <w:rPr>
+                <w:b/>
+                <w:i w:val="0"/>
+              </w:rPr>
+              <w:t>Coolant</w:t>
+            </w:r>
+          </w:p>
+        </w:tc>
+        <w:tc>
+          <w:tcPr>
+            <w:tcW w:type="dxa" w:w="5953"/>
+            <w:shd w:val="clear" w:color="auto" w:fill="E7EEF2"/>
+          </w:tcPr>
+          <w:p>
+            <w:r>
+              <w:rPr>
+                <w:b w:val="0"/>
+                <w:i w:val="0"/>
+              </w:rPr>
+              <w:t>6:4 ethylene-glycol / water mixture</w:t>
+            </w:r>
+          </w:p>
+        </w:tc>
+      </w:tr>
+      <w:tr>
+        <w:tc>
+          <w:tcPr>
+            <w:tcW w:type="dxa" w:w="3685"/>
+          </w:tcPr>
+          <w:p>
+            <w:r>
+              <w:rPr>
+                <w:b/>
+                <w:i w:val="0"/>
+              </w:rPr>
+              <w:t>Coolant flow rate</w:t>
+            </w:r>
+          </w:p>
+        </w:tc>
+        <w:tc>
+          <w:tcPr>
+            <w:tcW w:type="dxa" w:w="5953"/>
+          </w:tcPr>
+          <w:p>
+            <w:r>
+              <w:rPr>
+                <w:b w:val="0"/>
+                <w:i w:val="0"/>
+              </w:rPr>
+              <w:t>42 - 70 L/min (system)</w:t>
+            </w:r>
+          </w:p>
+        </w:tc>
+      </w:tr>
+      <w:tr>
+        <w:tc>
+          <w:tcPr>
+            <w:tcW w:type="dxa" w:w="3685"/>
+            <w:shd w:val="clear" w:color="auto" w:fill="E7EEF2"/>
+          </w:tcPr>
+          <w:p>
+            <w:r>
+              <w:rPr>
+                <w:b/>
+                <w:i w:val="0"/>
+              </w:rPr>
+              <w:t>Inlet pressure</w:t>
+            </w:r>
+          </w:p>
+        </w:tc>
+        <w:tc>
+          <w:tcPr>
+            <w:tcW w:type="dxa" w:w="5953"/>
+            <w:shd w:val="clear" w:color="auto" w:fill="E7EEF2"/>
+          </w:tcPr>
+          <w:p>
+            <w:r>
+              <w:rPr>
+                <w:b w:val="0"/>
+                <w:i w:val="0"/>
+              </w:rPr>
+              <w:t>&lt; 2 bar</w:t>
+            </w:r>
+          </w:p>
+        </w:tc>
+      </w:tr>
+      <w:tr>
+        <w:tc>
+          <w:tcPr>
+            <w:tcW w:type="dxa" w:w="3685"/>
+          </w:tcPr>
+          <w:p>
+            <w:r>
+              <w:rPr>
+                <w:b/>
+                <w:i w:val="0"/>
+              </w:rPr>
+              <w:t>Acoustic noise</w:t>
+            </w:r>
+          </w:p>
+        </w:tc>
+        <w:tc>
+          <w:tcPr>
+            <w:tcW w:type="dxa" w:w="5953"/>
+          </w:tcPr>
+          <w:p>
+            <w:r>
+              <w:rPr>
+                <w:b w:val="0"/>
+                <w:i w:val="0"/>
+              </w:rPr>
+              <w:t>Near-silent operation</w:t>
+            </w:r>
+          </w:p>
+        </w:tc>
+      </w:tr>
+      <w:tr>
+        <w:tc>
+          <w:tcPr>
+            <w:tcW w:type="dxa" w:w="5953"/>
+            <w:gridSpan w:val="2"/>
+            <w:shd w:val="clear" w:color="auto" w:fill="156082"/>
+          </w:tcPr>
+          <w:p>
+            <w:r>
+              <w:rPr>
+                <w:b/>
+                <w:i w:val="0"/>
+                <w:color w:val="FFFFFF"/>
+              </w:rPr>
+              <w:t>6.  Control &amp; Communication</w:t>
+            </w:r>
+          </w:p>
+        </w:tc>
+      </w:tr>
+      <w:tr>
+        <w:tc>
+          <w:tcPr>
+            <w:tcW w:type="dxa" w:w="3685"/>
+          </w:tcPr>
+          <w:p>
+            <w:r>
+              <w:rPr>
+                <w:b/>
+                <w:i w:val="0"/>
+              </w:rPr>
+              <w:t>Primary industrial protocol</w:t>
+            </w:r>
+          </w:p>
+        </w:tc>
+        <w:tc>
+          <w:tcPr>
+            <w:tcW w:type="dxa" w:w="5953"/>
+          </w:tcPr>
+          <w:p>
+            <w:r>
+              <w:rPr>
+                <w:b w:val="0"/>
+                <w:i w:val="0"/>
+              </w:rPr>
+              <w:t>Modbus TCP (via integrated gateway)</w:t>
+            </w:r>
+          </w:p>
+        </w:tc>
+      </w:tr>
+      <w:tr>
+        <w:tc>
+          <w:tcPr>
+            <w:tcW w:type="dxa" w:w="3685"/>
+            <w:shd w:val="clear" w:color="auto" w:fill="E7EEF2"/>
+          </w:tcPr>
+          <w:p>
+            <w:r>
+              <w:rPr>
+                <w:b/>
+                <w:i w:val="0"/>
+              </w:rPr>
+              <w:t>Module communication</w:t>
+            </w:r>
+          </w:p>
+        </w:tc>
+        <w:tc>
+          <w:tcPr>
+            <w:tcW w:type="dxa" w:w="5953"/>
+            <w:shd w:val="clear" w:color="auto" w:fill="E7EEF2"/>
+          </w:tcPr>
+          <w:p>
+            <w:r>
+              <w:rPr>
+                <w:b w:val="0"/>
+                <w:i w:val="0"/>
+              </w:rPr>
+              <w:t>CAN bus (internal)</w:t>
+            </w:r>
+          </w:p>
+        </w:tc>
+      </w:tr>
+      <w:tr>
+        <w:tc>
+          <w:tcPr>
+            <w:tcW w:type="dxa" w:w="3685"/>
+          </w:tcPr>
+          <w:p>
+            <w:r>
+              <w:rPr>
+                <w:b/>
+                <w:i w:val="0"/>
+              </w:rPr>
+              <w:t>Operation</w:t>
+            </w:r>
+          </w:p>
+        </w:tc>
+        <w:tc>
+          <w:tcPr>
+            <w:tcW w:type="dxa" w:w="5953"/>
+          </w:tcPr>
+          <w:p>
+            <w:r>
+              <w:rPr>
+                <w:b w:val="0"/>
+                <w:i w:val="0"/>
+              </w:rPr>
+              <w:t>Software grouping, master/slave current sharing</w:t>
+            </w:r>
+          </w:p>
+        </w:tc>
+      </w:tr>
+      <w:tr>
+        <w:tc>
+          <w:tcPr>
+            <w:tcW w:type="dxa" w:w="3685"/>
+            <w:shd w:val="clear" w:color="auto" w:fill="E7EEF2"/>
+          </w:tcPr>
+          <w:p>
+            <w:r>
+              <w:rPr>
+                <w:b/>
+                <w:i w:val="0"/>
+              </w:rPr>
+              <w:t>Local interface</w:t>
+            </w:r>
+          </w:p>
+        </w:tc>
+        <w:tc>
+          <w:tcPr>
+            <w:tcW w:type="dxa" w:w="5953"/>
+            <w:shd w:val="clear" w:color="auto" w:fill="E7EEF2"/>
+          </w:tcPr>
+          <w:p>
+            <w:r>
+              <w:rPr>
+                <w:b w:val="0"/>
+                <w:i w:val="0"/>
+              </w:rPr>
+              <w:t>HMI LED display: voltage, current, group, address, mode, fault status</w:t>
+            </w:r>
+          </w:p>
+        </w:tc>
+      </w:tr>
+      <w:tr>
+        <w:tc>
+          <w:tcPr>
+            <w:tcW w:type="dxa" w:w="3685"/>
+          </w:tcPr>
+          <w:p>
+            <w:r>
+              <w:rPr>
+                <w:b/>
+                <w:i w:val="0"/>
+              </w:rPr>
+              <w:t>Remote update</w:t>
+            </w:r>
+          </w:p>
+        </w:tc>
+        <w:tc>
+          <w:tcPr>
+            <w:tcW w:type="dxa" w:w="5953"/>
+          </w:tcPr>
+          <w:p>
+            <w:r>
+              <w:rPr>
+                <w:b w:val="0"/>
+                <w:i w:val="0"/>
+              </w:rPr>
+              <w:t>OTA firmware upgrade supported</w:t>
+            </w:r>
+          </w:p>
+        </w:tc>
+      </w:tr>
+      <w:tr>
+        <w:tc>
+          <w:tcPr>
+            <w:tcW w:type="dxa" w:w="5953"/>
+            <w:gridSpan w:val="2"/>
+            <w:shd w:val="clear" w:color="auto" w:fill="156082"/>
+          </w:tcPr>
+          <w:p>
+            <w:r>
+              <w:rPr>
+                <w:b/>
+                <w:i w:val="0"/>
+                <w:color w:val="FFFFFF"/>
+              </w:rPr>
+              <w:t>7.  Environmental &amp; Mechanical</w:t>
+            </w:r>
+          </w:p>
+        </w:tc>
+      </w:tr>
+      <w:tr>
+        <w:tc>
+          <w:tcPr>
+            <w:tcW w:type="dxa" w:w="3685"/>
+          </w:tcPr>
+          <w:p>
+            <w:r>
+              <w:rPr>
+                <w:b/>
+                <w:i w:val="0"/>
+              </w:rPr>
+              <w:t>Operating temperature</w:t>
+            </w:r>
+          </w:p>
+        </w:tc>
+        <w:tc>
+          <w:tcPr>
+            <w:tcW w:type="dxa" w:w="5953"/>
+          </w:tcPr>
+          <w:p>
+            <w:r>
+              <w:rPr>
+                <w:b w:val="0"/>
+                <w:i w:val="0"/>
+              </w:rPr>
+              <w:t>-40 C to +75 C (derates from +60 C)</w:t>
+            </w:r>
+          </w:p>
+        </w:tc>
+      </w:tr>
+      <w:tr>
+        <w:tc>
+          <w:tcPr>
+            <w:tcW w:type="dxa" w:w="3685"/>
+            <w:shd w:val="clear" w:color="auto" w:fill="E7EEF2"/>
+          </w:tcPr>
+          <w:p>
+            <w:r>
+              <w:rPr>
+                <w:b/>
+                <w:i w:val="0"/>
+              </w:rPr>
+              <w:t>Storage temperature</w:t>
+            </w:r>
+          </w:p>
+        </w:tc>
+        <w:tc>
+          <w:tcPr>
+            <w:tcW w:type="dxa" w:w="5953"/>
+            <w:shd w:val="clear" w:color="auto" w:fill="E7EEF2"/>
+          </w:tcPr>
+          <w:p>
+            <w:r>
+              <w:rPr>
+                <w:b w:val="0"/>
+                <w:i w:val="0"/>
+              </w:rPr>
+              <w:t>-40 C to +85 C</w:t>
+            </w:r>
+          </w:p>
+        </w:tc>
+      </w:tr>
+      <w:tr>
+        <w:tc>
+          <w:tcPr>
+            <w:tcW w:type="dxa" w:w="3685"/>
+          </w:tcPr>
+          <w:p>
+            <w:r>
+              <w:rPr>
+                <w:b/>
+                <w:i w:val="0"/>
+              </w:rPr>
+              <w:t>Humidity</w:t>
+            </w:r>
+          </w:p>
+        </w:tc>
+        <w:tc>
+          <w:tcPr>
+            <w:tcW w:type="dxa" w:w="5953"/>
+          </w:tcPr>
+          <w:p>
+            <w:r>
+              <w:rPr>
+                <w:b w:val="0"/>
+                <w:i w:val="0"/>
+              </w:rPr>
+              <w:t>&lt;= 95 % RH, non-condensing</w:t>
+            </w:r>
+          </w:p>
+        </w:tc>
+      </w:tr>
+      <w:tr>
+        <w:tc>
+          <w:tcPr>
+            <w:tcW w:type="dxa" w:w="3685"/>
+            <w:shd w:val="clear" w:color="auto" w:fill="E7EEF2"/>
+          </w:tcPr>
+          <w:p>
+            <w:r>
+              <w:rPr>
+                <w:b/>
+                <w:i w:val="0"/>
+              </w:rPr>
+              <w:t>Altitude / pressure</w:t>
+            </w:r>
+          </w:p>
+        </w:tc>
+        <w:tc>
+          <w:tcPr>
+            <w:tcW w:type="dxa" w:w="5953"/>
+            <w:shd w:val="clear" w:color="auto" w:fill="E7EEF2"/>
+          </w:tcPr>
+          <w:p>
+            <w:r>
+              <w:rPr>
+                <w:b w:val="0"/>
+                <w:i w:val="0"/>
+              </w:rPr>
+              <w:t>up to 2000 m / 79 - 110 kPa</w:t>
+            </w:r>
+          </w:p>
+        </w:tc>
+      </w:tr>
+      <w:tr>
+        <w:tc>
+          <w:tcPr>
+            <w:tcW w:type="dxa" w:w="3685"/>
+          </w:tcPr>
+          <w:p>
+            <w:r>
+              <w:rPr>
+                <w:b/>
+                <w:i w:val="0"/>
+              </w:rPr>
+              <w:t>Protection rating (modules)</w:t>
+            </w:r>
+          </w:p>
+        </w:tc>
+        <w:tc>
+          <w:tcPr>
+            <w:tcW w:type="dxa" w:w="5953"/>
+          </w:tcPr>
+          <w:p>
+            <w:r>
+              <w:rPr>
+                <w:b w:val="0"/>
+                <w:i w:val="0"/>
+              </w:rPr>
+              <w:t>IP65</w:t>
+            </w:r>
+          </w:p>
+        </w:tc>
+      </w:tr>
+      <w:tr>
+        <w:tc>
+          <w:tcPr>
+            <w:tcW w:type="dxa" w:w="3685"/>
+            <w:shd w:val="clear" w:color="auto" w:fill="E7EEF2"/>
+          </w:tcPr>
+          <w:p>
+            <w:r>
+              <w:rPr>
+                <w:b/>
+                <w:i w:val="0"/>
+              </w:rPr>
+              <w:t>Vibration / mobility</w:t>
+            </w:r>
+          </w:p>
+        </w:tc>
+        <w:tc>
+          <w:tcPr>
+            <w:tcW w:type="dxa" w:w="5953"/>
+            <w:shd w:val="clear" w:color="auto" w:fill="E7EEF2"/>
+          </w:tcPr>
+          <w:p>
+            <w:r>
+              <w:rPr>
+                <w:b w:val="0"/>
+                <w:i w:val="0"/>
+              </w:rPr>
+              <w:t>Suitable for mobile / vibration-exposed installations</w:t>
+            </w:r>
+          </w:p>
+        </w:tc>
+      </w:tr>
+      <w:tr>
+        <w:tc>
+          <w:tcPr>
+            <w:tcW w:type="dxa" w:w="3685"/>
+          </w:tcPr>
+          <w:p>
+            <w:r>
+              <w:rPr>
+                <w:b/>
+                <w:i w:val="0"/>
+              </w:rPr>
+              <w:t>Serviceability</w:t>
+            </w:r>
+          </w:p>
+        </w:tc>
+        <w:tc>
+          <w:tcPr>
+            <w:tcW w:type="dxa" w:w="5953"/>
+          </w:tcPr>
+          <w:p>
+            <w:r>
+              <w:rPr>
+                <w:b w:val="0"/>
+                <w:i w:val="0"/>
+              </w:rPr>
+              <w:t>Hot-swappable modules; service without microgrid interruption</w:t>
+            </w:r>
+          </w:p>
+        </w:tc>
+      </w:tr>
+      <w:tr>
+        <w:tc>
+          <w:tcPr>
+            <w:tcW w:type="dxa" w:w="5953"/>
+            <w:gridSpan w:val="2"/>
+            <w:shd w:val="clear" w:color="auto" w:fill="156082"/>
+          </w:tcPr>
+          <w:p>
+            <w:r>
+              <w:rPr>
+                <w:b/>
+                <w:i w:val="0"/>
+                <w:color w:val="FFFFFF"/>
+              </w:rPr>
+              <w:t>8.  Compliance &amp; Safety</w:t>
+            </w:r>
+          </w:p>
+        </w:tc>
+      </w:tr>
+      <w:tr>
+        <w:tc>
+          <w:tcPr>
+            <w:tcW w:type="dxa" w:w="3685"/>
+          </w:tcPr>
+          <w:p>
+            <w:r>
+              <w:rPr>
+                <w:b/>
+                <w:i w:val="0"/>
+              </w:rPr>
+              <w:t>Certification</w:t>
+            </w:r>
+          </w:p>
+        </w:tc>
+        <w:tc>
+          <w:tcPr>
+            <w:tcW w:type="dxa" w:w="5953"/>
+          </w:tcPr>
+          <w:p>
+            <w:r>
+              <w:rPr>
+                <w:b w:val="0"/>
+                <w:i w:val="0"/>
+              </w:rPr>
+              <w:t>CE</w:t>
+            </w:r>
+          </w:p>
+        </w:tc>
+      </w:tr>
+      <w:tr>
+        <w:tc>
+          <w:tcPr>
+            <w:tcW w:type="dxa" w:w="3685"/>
+            <w:shd w:val="clear" w:color="auto" w:fill="E7EEF2"/>
+          </w:tcPr>
+          <w:p>
+            <w:r>
+              <w:rPr>
+                <w:b/>
+                <w:i w:val="0"/>
+              </w:rPr>
+              <w:t>Installation standards</w:t>
+            </w:r>
+          </w:p>
+        </w:tc>
+        <w:tc>
+          <w:tcPr>
+            <w:tcW w:type="dxa" w:w="5953"/>
+            <w:shd w:val="clear" w:color="auto" w:fill="E7EEF2"/>
+          </w:tcPr>
+          <w:p>
+            <w:r>
+              <w:rPr>
+                <w:b w:val="0"/>
+                <w:i w:val="0"/>
+              </w:rPr>
+              <w:t>IEC 61439, NEN 1010</w:t>
+            </w:r>
+          </w:p>
+        </w:tc>
+      </w:tr>
+      <w:tr>
+        <w:tc>
+          <w:tcPr>
+            <w:tcW w:type="dxa" w:w="3685"/>
+          </w:tcPr>
+          <w:p>
+            <w:r>
+              <w:rPr>
+                <w:b/>
+                <w:i w:val="0"/>
+              </w:rPr>
+              <w:t>EMC</w:t>
+            </w:r>
+          </w:p>
+        </w:tc>
+        <w:tc>
+          <w:tcPr>
+            <w:tcW w:type="dxa" w:w="5953"/>
+          </w:tcPr>
+          <w:p>
+            <w:r>
+              <w:rPr>
+                <w:b w:val="0"/>
+                <w:i w:val="0"/>
+              </w:rPr>
+              <w:t>IEC 61000 (industrial)</w:t>
+            </w:r>
+          </w:p>
+        </w:tc>
+      </w:tr>
+      <w:tr>
+        <w:tc>
+          <w:tcPr>
+            <w:tcW w:type="dxa" w:w="3685"/>
+            <w:shd w:val="clear" w:color="auto" w:fill="E7EEF2"/>
+          </w:tcPr>
+          <w:p>
+            <w:r>
+              <w:rPr>
+                <w:b/>
+                <w:i w:val="0"/>
+              </w:rPr>
+              <w:t>Protection features</w:t>
+            </w:r>
+          </w:p>
+        </w:tc>
+        <w:tc>
+          <w:tcPr>
+            <w:tcW w:type="dxa" w:w="5953"/>
+            <w:shd w:val="clear" w:color="auto" w:fill="E7EEF2"/>
+          </w:tcPr>
+          <w:p>
+            <w:r>
+              <w:rPr>
+                <w:b w:val="0"/>
+                <w:i w:val="0"/>
+              </w:rPr>
+              <w:t>Battery back-feed protection - residual voltage discharge circuit - fault monitoring</w:t>
+            </w:r>
+          </w:p>
+        </w:tc>
+      </w:tr>
+      <w:tr>
+        <w:tc>
+          <w:tcPr>
+            <w:tcW w:type="dxa" w:w="3685"/>
+          </w:tcPr>
+          <w:p>
+            <w:r>
+              <w:rPr>
+                <w:b/>
+                <w:i w:val="0"/>
+              </w:rPr>
+              <w:t>System reliability</w:t>
+            </w:r>
+          </w:p>
+        </w:tc>
+        <w:tc>
+          <w:tcPr>
+            <w:tcW w:type="dxa" w:w="5953"/>
+          </w:tcPr>
+          <w:p>
+            <w:r>
+              <w:rPr>
+                <w:b w:val="0"/>
+                <w:i w:val="0"/>
+              </w:rPr>
+              <w:t>&gt; 98 % uptime (design target)</w:t>
             </w:r>
           </w:p>
         </w:tc>
       </w:tr>
     </w:tbl>
     <w:p>
-      <w:pPr>
-        <w:rPr>
-          <w:lang w:val="en-US"/>
-        </w:rPr>
-      </w:pPr>
+      <w:pPr/>
     </w:p>
     <w:p>
-      <w:pPr>
-        <w:pStyle w:val="Kop1"/>
-      </w:pPr>
-      <w:r>
-        <w:t>DC Output</w:t>
-      </w:r>
-    </w:p>
-    <w:tbl>
-      <w:tblPr>
-        <w:tblStyle w:val="Tabelraster"/>
-        <w:tblW w:w="0" w:type="auto"/>
-        <w:tblLook w:val="04A0" w:firstRow="1" w:lastRow="0" w:firstColumn="1" w:lastColumn="0" w:noHBand="0" w:noVBand="1"/>
-      </w:tblPr>
-      <w:tblGrid>
-        <w:gridCol w:w="4508"/>
-        <w:gridCol w:w="4508"/>
-      </w:tblGrid>
-      <w:tr>
-        <w:tc>
-          <w:tcPr>
-            <w:tcW w:w="4513" w:type="dxa"/>
-          </w:tcPr>
-          <w:p>
-            <w:r>
-              <w:rPr>
-                <w:b/>
-              </w:rPr>
-              <w:t>Parameter</w:t>
-            </w:r>
-          </w:p>
-        </w:tc>
-        <w:tc>
-          <w:tcPr>
-            <w:tcW w:w="4513" w:type="dxa"/>
-          </w:tcPr>
-          <w:p>
-            <w:proofErr w:type="spellStart"/>
-            <w:r>
-              <w:rPr>
-                <w:b/>
-              </w:rPr>
-              <w:t>Specification</w:t>
-            </w:r>
-            <w:proofErr w:type="spellEnd"/>
-          </w:p>
-        </w:tc>
-      </w:tr>
-      <w:tr>
-        <w:tc>
-          <w:tcPr>
-            <w:tcW w:w="4513" w:type="dxa"/>
-          </w:tcPr>
-          <w:p>
-            <w:r>
-              <w:t>Output voltage range</w:t>
-            </w:r>
-          </w:p>
-        </w:tc>
-        <w:tc>
-          <w:tcPr>
-            <w:tcW w:w="4513" w:type="dxa"/>
-          </w:tcPr>
-          <w:p>
-            <w:r>
-              <w:t>150 - 1000 VDC</w:t>
-            </w:r>
-          </w:p>
-        </w:tc>
-      </w:tr>
-      <w:tr>
-        <w:tc>
-          <w:tcPr>
-            <w:tcW w:w="4513" w:type="dxa"/>
-          </w:tcPr>
-          <w:p>
-            <w:proofErr w:type="spellStart"/>
-            <w:r>
-              <w:t>Recommended</w:t>
-            </w:r>
-            <w:proofErr w:type="spellEnd"/>
-            <w:r>
-              <w:t xml:space="preserve"> operating </w:t>
-            </w:r>
-            <w:proofErr w:type="spellStart"/>
-            <w:r>
-              <w:t>window</w:t>
-            </w:r>
-            <w:proofErr w:type="spellEnd"/>
-          </w:p>
-        </w:tc>
-        <w:tc>
-          <w:tcPr>
-            <w:tcW w:w="4513" w:type="dxa"/>
-          </w:tcPr>
-          <w:p>
-            <w:r>
-              <w:t>600 - 800 VDC</w:t>
-            </w:r>
-          </w:p>
-        </w:tc>
-      </w:tr>
-      <w:tr>
-        <w:tc>
-          <w:tcPr>
-            <w:tcW w:w="4513" w:type="dxa"/>
-          </w:tcPr>
-          <w:p>
-            <w:proofErr w:type="spellStart"/>
-            <w:r>
-              <w:t>Rated</w:t>
-            </w:r>
-            <w:proofErr w:type="spellEnd"/>
-            <w:r>
-              <w:t xml:space="preserve"> output power</w:t>
-            </w:r>
-          </w:p>
-        </w:tc>
-        <w:tc>
-          <w:tcPr>
-            <w:tcW w:w="4513" w:type="dxa"/>
-          </w:tcPr>
-          <w:p>
-            <w:r>
-              <w:t>280 kW (</w:t>
-            </w:r>
-            <w:proofErr w:type="spellStart"/>
-            <w:r>
-              <w:t>continuous</w:t>
-            </w:r>
-            <w:proofErr w:type="spellEnd"/>
-            <w:r>
-              <w:t>)</w:t>
-            </w:r>
-          </w:p>
-        </w:tc>
-      </w:tr>
-      <w:tr>
-        <w:tc>
-          <w:tcPr>
-            <w:tcW w:w="4513" w:type="dxa"/>
-          </w:tcPr>
-          <w:p>
-            <w:proofErr w:type="spellStart"/>
-            <w:r>
-              <w:t>Rated</w:t>
-            </w:r>
-            <w:proofErr w:type="spellEnd"/>
-            <w:r>
-              <w:t xml:space="preserve"> output </w:t>
-            </w:r>
-            <w:proofErr w:type="spellStart"/>
-            <w:r>
-              <w:t>current</w:t>
-            </w:r>
-            <w:proofErr w:type="spellEnd"/>
-          </w:p>
-        </w:tc>
-        <w:tc>
-          <w:tcPr>
-            <w:tcW w:w="4513" w:type="dxa"/>
-          </w:tcPr>
-          <w:p>
-            <w:r>
-              <w:t>280 A</w:t>
-            </w:r>
-          </w:p>
-        </w:tc>
-      </w:tr>
-      <w:tr>
-        <w:tc>
-          <w:tcPr>
-            <w:tcW w:w="4513" w:type="dxa"/>
-          </w:tcPr>
-          <w:p>
-            <w:pPr>
-              <w:rPr>
-                <w:lang w:val="en-US"/>
-              </w:rPr>
-            </w:pPr>
-            <w:r>
-              <w:rPr>
-                <w:lang w:val="en-US"/>
-              </w:rPr>
-              <w:t>Maximum output current (constant-power region)</w:t>
-            </w:r>
-          </w:p>
-        </w:tc>
-        <w:tc>
-          <w:tcPr>
-            <w:tcW w:w="4513" w:type="dxa"/>
-          </w:tcPr>
-          <w:p>
-            <w:r>
-              <w:t xml:space="preserve">up </w:t>
-            </w:r>
-            <w:proofErr w:type="spellStart"/>
-            <w:r>
-              <w:t>to</w:t>
-            </w:r>
-            <w:proofErr w:type="spellEnd"/>
-            <w:r>
-              <w:t xml:space="preserve"> 933 A</w:t>
-            </w:r>
-          </w:p>
-        </w:tc>
-      </w:tr>
-      <w:tr>
-        <w:tc>
-          <w:tcPr>
-            <w:tcW w:w="4513" w:type="dxa"/>
-          </w:tcPr>
-          <w:p>
-            <w:r>
-              <w:t xml:space="preserve">Voltage </w:t>
-            </w:r>
-            <w:proofErr w:type="spellStart"/>
-            <w:r>
-              <w:t>stabilization</w:t>
-            </w:r>
-            <w:proofErr w:type="spellEnd"/>
-            <w:r>
-              <w:t xml:space="preserve"> </w:t>
-            </w:r>
-            <w:proofErr w:type="spellStart"/>
-            <w:r>
-              <w:t>accuracy</w:t>
-            </w:r>
-            <w:proofErr w:type="spellEnd"/>
-          </w:p>
-        </w:tc>
-        <w:tc>
-          <w:tcPr>
-            <w:tcW w:w="4513" w:type="dxa"/>
-          </w:tcPr>
-          <w:p>
-            <w:r>
-              <w:t>&lt;= +/-0.5 %</w:t>
-            </w:r>
-          </w:p>
-        </w:tc>
-      </w:tr>
-      <w:tr>
-        <w:tc>
-          <w:tcPr>
-            <w:tcW w:w="4513" w:type="dxa"/>
-          </w:tcPr>
-          <w:p>
-            <w:proofErr w:type="spellStart"/>
-            <w:r>
-              <w:t>Current</w:t>
-            </w:r>
-            <w:proofErr w:type="spellEnd"/>
-            <w:r>
-              <w:t xml:space="preserve"> </w:t>
-            </w:r>
-            <w:proofErr w:type="spellStart"/>
-            <w:r>
-              <w:t>stabilization</w:t>
-            </w:r>
-            <w:proofErr w:type="spellEnd"/>
-            <w:r>
-              <w:t xml:space="preserve"> </w:t>
-            </w:r>
-            <w:proofErr w:type="spellStart"/>
-            <w:r>
-              <w:t>accuracy</w:t>
-            </w:r>
-            <w:proofErr w:type="spellEnd"/>
-          </w:p>
-        </w:tc>
-        <w:tc>
-          <w:tcPr>
-            <w:tcW w:w="4513" w:type="dxa"/>
-          </w:tcPr>
-          <w:p>
-            <w:r>
-              <w:t>&lt;= +/-1 %</w:t>
-            </w:r>
-          </w:p>
-        </w:tc>
-      </w:tr>
-      <w:tr>
-        <w:tc>
-          <w:tcPr>
-            <w:tcW w:w="4513" w:type="dxa"/>
-          </w:tcPr>
-          <w:p>
-            <w:r>
-              <w:t xml:space="preserve">Voltage </w:t>
-            </w:r>
-            <w:proofErr w:type="spellStart"/>
-            <w:r>
-              <w:t>set-point</w:t>
-            </w:r>
-            <w:proofErr w:type="spellEnd"/>
-            <w:r>
-              <w:t xml:space="preserve"> error</w:t>
-            </w:r>
-          </w:p>
-        </w:tc>
-        <w:tc>
-          <w:tcPr>
-            <w:tcW w:w="4513" w:type="dxa"/>
-          </w:tcPr>
-          <w:p>
-            <w:r>
-              <w:t>&lt;= +/-0.5 %</w:t>
-            </w:r>
-          </w:p>
-        </w:tc>
-      </w:tr>
-      <w:tr>
-        <w:tc>
-          <w:tcPr>
-            <w:tcW w:w="4513" w:type="dxa"/>
-          </w:tcPr>
-          <w:p>
-            <w:r>
-              <w:t>Power flow</w:t>
-            </w:r>
-          </w:p>
-        </w:tc>
-        <w:tc>
-          <w:tcPr>
-            <w:tcW w:w="4513" w:type="dxa"/>
-          </w:tcPr>
-          <w:p>
-            <w:proofErr w:type="spellStart"/>
-            <w:r>
-              <w:t>Unidirectional</w:t>
-            </w:r>
-            <w:proofErr w:type="spellEnd"/>
-          </w:p>
-        </w:tc>
-      </w:tr>
-      <w:tr>
-        <w:tc>
-          <w:tcPr>
-            <w:tcW w:w="4513" w:type="dxa"/>
-          </w:tcPr>
-          <w:p>
-            <w:proofErr w:type="spellStart"/>
-            <w:r>
-              <w:t>Isolation</w:t>
-            </w:r>
-            <w:proofErr w:type="spellEnd"/>
-          </w:p>
-        </w:tc>
-        <w:tc>
-          <w:tcPr>
-            <w:tcW w:w="4513" w:type="dxa"/>
-          </w:tcPr>
-          <w:p>
-            <w:pPr>
-              <w:rPr>
-                <w:lang w:val="en-US"/>
-              </w:rPr>
-            </w:pPr>
-            <w:r>
-              <w:rPr>
-                <w:lang w:val="en-US"/>
-              </w:rPr>
-              <w:t>Galvanic isolation between AC and DC</w:t>
-            </w:r>
-          </w:p>
-        </w:tc>
-      </w:tr>
-    </w:tbl>
-    <w:p>
-      <w:pPr>
-        <w:rPr>
-          <w:lang w:val="en-US"/>
-        </w:rPr>
-      </w:pPr>
-    </w:p>
-    <w:p>
-      <w:pPr>
-        <w:pStyle w:val="Kop1"/>
-      </w:pPr>
-      <w:r>
-        <w:t>Performance &amp; Efficiency</w:t>
-      </w:r>
-    </w:p>
-    <w:tbl>
-      <w:tblPr>
-        <w:tblStyle w:val="Tabelraster"/>
-        <w:tblW w:w="0" w:type="auto"/>
-        <w:tblLook w:val="04A0" w:firstRow="1" w:lastRow="0" w:firstColumn="1" w:lastColumn="0" w:noHBand="0" w:noVBand="1"/>
-      </w:tblPr>
-      <w:tblGrid>
-        <w:gridCol w:w="4508"/>
-        <w:gridCol w:w="4508"/>
-      </w:tblGrid>
-      <w:tr>
-        <w:tc>
-          <w:tcPr>
-            <w:tcW w:w="4513" w:type="dxa"/>
-          </w:tcPr>
-          <w:p>
-            <w:r>
-              <w:rPr>
-                <w:b/>
-              </w:rPr>
-              <w:t>Parameter</w:t>
-            </w:r>
-          </w:p>
-        </w:tc>
-        <w:tc>
-          <w:tcPr>
-            <w:tcW w:w="4513" w:type="dxa"/>
-          </w:tcPr>
-          <w:p>
-            <w:proofErr w:type="spellStart"/>
-            <w:r>
-              <w:rPr>
-                <w:b/>
-              </w:rPr>
-              <w:t>Specification</w:t>
-            </w:r>
-            <w:proofErr w:type="spellEnd"/>
-          </w:p>
-        </w:tc>
-      </w:tr>
-      <w:tr>
-        <w:tc>
-          <w:tcPr>
-            <w:tcW w:w="4513" w:type="dxa"/>
-          </w:tcPr>
-          <w:p>
-            <w:r>
-              <w:t>Peak efficiency</w:t>
-            </w:r>
-          </w:p>
-        </w:tc>
-        <w:tc>
-          <w:tcPr>
-            <w:tcW w:w="4513" w:type="dxa"/>
-          </w:tcPr>
-          <w:p>
-            <w:r>
-              <w:t>&gt; 97 %</w:t>
-            </w:r>
-          </w:p>
-        </w:tc>
-      </w:tr>
-      <w:tr>
-        <w:tc>
-          <w:tcPr>
-            <w:tcW w:w="4513" w:type="dxa"/>
-          </w:tcPr>
-          <w:p>
-            <w:proofErr w:type="spellStart"/>
-            <w:r>
-              <w:t>Standby</w:t>
-            </w:r>
-            <w:proofErr w:type="spellEnd"/>
-            <w:r>
-              <w:t xml:space="preserve"> power </w:t>
-            </w:r>
-            <w:proofErr w:type="spellStart"/>
-            <w:r>
-              <w:t>consumption</w:t>
-            </w:r>
-            <w:proofErr w:type="spellEnd"/>
-          </w:p>
-        </w:tc>
-        <w:tc>
-          <w:tcPr>
-            <w:tcW w:w="4513" w:type="dxa"/>
-          </w:tcPr>
-          <w:p>
-            <w:r>
-              <w:t>&lt; 70 W (system)</w:t>
-            </w:r>
-          </w:p>
-        </w:tc>
-      </w:tr>
-      <w:tr>
-        <w:tc>
-          <w:tcPr>
-            <w:tcW w:w="4513" w:type="dxa"/>
-          </w:tcPr>
-          <w:p>
-            <w:r>
-              <w:t xml:space="preserve">Minimum </w:t>
-            </w:r>
-            <w:proofErr w:type="spellStart"/>
-            <w:r>
-              <w:t>settable</w:t>
-            </w:r>
-            <w:proofErr w:type="spellEnd"/>
-            <w:r>
-              <w:t xml:space="preserve"> power</w:t>
-            </w:r>
-          </w:p>
-        </w:tc>
-        <w:tc>
-          <w:tcPr>
-            <w:tcW w:w="4513" w:type="dxa"/>
-          </w:tcPr>
-          <w:p>
-            <w:r>
-              <w:t>&gt;= 55 kW / 80 A</w:t>
-            </w:r>
-          </w:p>
-        </w:tc>
-      </w:tr>
-      <w:tr>
-        <w:tc>
-          <w:tcPr>
-            <w:tcW w:w="4513" w:type="dxa"/>
-          </w:tcPr>
-          <w:p>
-            <w:r>
-              <w:t xml:space="preserve">Power </w:t>
-            </w:r>
-            <w:proofErr w:type="spellStart"/>
-            <w:r>
-              <w:t>resolution</w:t>
-            </w:r>
-            <w:proofErr w:type="spellEnd"/>
-          </w:p>
-        </w:tc>
-        <w:tc>
-          <w:tcPr>
-            <w:tcW w:w="4513" w:type="dxa"/>
-          </w:tcPr>
-          <w:p>
-            <w:r>
-              <w:t>Modular steps of 40 kW</w:t>
-            </w:r>
-          </w:p>
-        </w:tc>
-      </w:tr>
-      <w:tr>
-        <w:tc>
-          <w:tcPr>
-            <w:tcW w:w="4513" w:type="dxa"/>
-          </w:tcPr>
-          <w:p>
-            <w:proofErr w:type="spellStart"/>
-            <w:r>
-              <w:t>Redundancy</w:t>
-            </w:r>
-            <w:proofErr w:type="spellEnd"/>
-          </w:p>
-        </w:tc>
-        <w:tc>
-          <w:tcPr>
-            <w:tcW w:w="4513" w:type="dxa"/>
-          </w:tcPr>
-          <w:p>
-            <w:r>
-              <w:t xml:space="preserve">N+1 </w:t>
-            </w:r>
-            <w:proofErr w:type="spellStart"/>
-            <w:r>
-              <w:t>capable</w:t>
-            </w:r>
-            <w:proofErr w:type="spellEnd"/>
-            <w:r>
-              <w:t xml:space="preserve"> (module-level)</w:t>
-            </w:r>
-          </w:p>
-        </w:tc>
-      </w:tr>
-    </w:tbl>
-    <w:p/>
-    <w:p>
-      <w:pPr>
-        <w:rPr>
-          <w:rFonts w:asciiTheme="majorHAnsi" w:eastAsiaTheme="majorEastAsia" w:hAnsiTheme="majorHAnsi" w:cstheme="majorBidi"/>
-          <w:color w:val="0F4761" w:themeColor="accent1" w:themeShade="BF"/>
-          <w:sz w:val="40"/>
-          <w:szCs w:val="40"/>
-        </w:rPr>
-      </w:pPr>
-      <w:r>
-        <w:br w:type="page"/>
-      </w:r>
-    </w:p>
-    <w:p>
-      <w:pPr>
-        <w:pStyle w:val="Kop1"/>
-      </w:pPr>
-      <w:proofErr w:type="spellStart"/>
-      <w:r>
-        <w:lastRenderedPageBreak/>
-        <w:t>Cooling</w:t>
-      </w:r>
-      <w:proofErr w:type="spellEnd"/>
-      <w:r>
-        <w:t xml:space="preserve"> System</w:t>
-      </w:r>
-    </w:p>
-    <w:tbl>
-      <w:tblPr>
-        <w:tblStyle w:val="Tabelraster"/>
-        <w:tblW w:w="0" w:type="auto"/>
-        <w:tblLook w:val="04A0" w:firstRow="1" w:lastRow="0" w:firstColumn="1" w:lastColumn="0" w:noHBand="0" w:noVBand="1"/>
-      </w:tblPr>
-      <w:tblGrid>
-        <w:gridCol w:w="4508"/>
-        <w:gridCol w:w="4508"/>
-      </w:tblGrid>
-      <w:tr>
-        <w:tc>
-          <w:tcPr>
-            <w:tcW w:w="4513" w:type="dxa"/>
-          </w:tcPr>
-          <w:p>
-            <w:r>
-              <w:rPr>
-                <w:b/>
-              </w:rPr>
-              <w:t>Parameter</w:t>
-            </w:r>
-          </w:p>
-        </w:tc>
-        <w:tc>
-          <w:tcPr>
-            <w:tcW w:w="4513" w:type="dxa"/>
-          </w:tcPr>
-          <w:p>
-            <w:proofErr w:type="spellStart"/>
-            <w:r>
-              <w:rPr>
-                <w:b/>
-              </w:rPr>
-              <w:t>Specification</w:t>
-            </w:r>
-            <w:proofErr w:type="spellEnd"/>
-          </w:p>
-        </w:tc>
-      </w:tr>
-      <w:tr>
-        <w:tc>
-          <w:tcPr>
-            <w:tcW w:w="4513" w:type="dxa"/>
-          </w:tcPr>
-          <w:p>
-            <w:proofErr w:type="spellStart"/>
-            <w:r>
-              <w:t>Cooling</w:t>
-            </w:r>
-            <w:proofErr w:type="spellEnd"/>
-            <w:r>
-              <w:t xml:space="preserve"> </w:t>
-            </w:r>
-            <w:proofErr w:type="spellStart"/>
-            <w:r>
-              <w:t>method</w:t>
-            </w:r>
-            <w:proofErr w:type="spellEnd"/>
-          </w:p>
-        </w:tc>
-        <w:tc>
-          <w:tcPr>
-            <w:tcW w:w="4513" w:type="dxa"/>
-          </w:tcPr>
-          <w:p>
-            <w:r>
-              <w:t>Liquid (</w:t>
-            </w:r>
-            <w:proofErr w:type="spellStart"/>
-            <w:r>
-              <w:t>closed</w:t>
-            </w:r>
-            <w:proofErr w:type="spellEnd"/>
-            <w:r>
-              <w:t xml:space="preserve"> loop)</w:t>
-            </w:r>
-          </w:p>
-        </w:tc>
-      </w:tr>
-      <w:tr>
-        <w:tc>
-          <w:tcPr>
-            <w:tcW w:w="4513" w:type="dxa"/>
-          </w:tcPr>
-          <w:p>
-            <w:proofErr w:type="spellStart"/>
-            <w:r>
-              <w:t>Coolant</w:t>
-            </w:r>
-            <w:proofErr w:type="spellEnd"/>
-          </w:p>
-        </w:tc>
-        <w:tc>
-          <w:tcPr>
-            <w:tcW w:w="4513" w:type="dxa"/>
-          </w:tcPr>
-          <w:p>
-            <w:r>
-              <w:t xml:space="preserve">6:4 </w:t>
-            </w:r>
-            <w:proofErr w:type="spellStart"/>
-            <w:r>
-              <w:t>ethylene</w:t>
-            </w:r>
-            <w:proofErr w:type="spellEnd"/>
-            <w:r>
-              <w:t>-glycol / water mixture</w:t>
-            </w:r>
-          </w:p>
-        </w:tc>
-      </w:tr>
-      <w:tr>
-        <w:tc>
-          <w:tcPr>
-            <w:tcW w:w="4513" w:type="dxa"/>
-          </w:tcPr>
-          <w:p>
-            <w:proofErr w:type="spellStart"/>
-            <w:r>
-              <w:t>Coolant</w:t>
-            </w:r>
-            <w:proofErr w:type="spellEnd"/>
-            <w:r>
-              <w:t xml:space="preserve"> flow </w:t>
-            </w:r>
-            <w:proofErr w:type="spellStart"/>
-            <w:r>
-              <w:t>rate</w:t>
-            </w:r>
-            <w:proofErr w:type="spellEnd"/>
-          </w:p>
-        </w:tc>
-        <w:tc>
-          <w:tcPr>
-            <w:tcW w:w="4513" w:type="dxa"/>
-          </w:tcPr>
-          <w:p>
-            <w:r>
-              <w:t>42 - 70 L/min (system)</w:t>
-            </w:r>
-          </w:p>
-        </w:tc>
-      </w:tr>
-      <w:tr>
-        <w:tc>
-          <w:tcPr>
-            <w:tcW w:w="4513" w:type="dxa"/>
-          </w:tcPr>
-          <w:p>
-            <w:proofErr w:type="spellStart"/>
-            <w:r>
-              <w:t>Inlet</w:t>
-            </w:r>
-            <w:proofErr w:type="spellEnd"/>
-            <w:r>
-              <w:t xml:space="preserve"> </w:t>
-            </w:r>
-            <w:proofErr w:type="spellStart"/>
-            <w:r>
-              <w:t>pressure</w:t>
-            </w:r>
-            <w:proofErr w:type="spellEnd"/>
-          </w:p>
-        </w:tc>
-        <w:tc>
-          <w:tcPr>
-            <w:tcW w:w="4513" w:type="dxa"/>
-          </w:tcPr>
-          <w:p>
-            <w:r>
-              <w:t>&lt; 2 bar</w:t>
-            </w:r>
-          </w:p>
-        </w:tc>
-      </w:tr>
-      <w:tr>
-        <w:tc>
-          <w:tcPr>
-            <w:tcW w:w="4513" w:type="dxa"/>
-          </w:tcPr>
-          <w:p>
-            <w:proofErr w:type="spellStart"/>
-            <w:r>
-              <w:t>Acoustic</w:t>
-            </w:r>
-            <w:proofErr w:type="spellEnd"/>
-            <w:r>
-              <w:t xml:space="preserve"> </w:t>
-            </w:r>
-            <w:proofErr w:type="spellStart"/>
-            <w:r>
-              <w:t>noise</w:t>
-            </w:r>
-            <w:proofErr w:type="spellEnd"/>
-          </w:p>
-        </w:tc>
-        <w:tc>
-          <w:tcPr>
-            <w:tcW w:w="4513" w:type="dxa"/>
-          </w:tcPr>
-          <w:p>
-            <w:proofErr w:type="spellStart"/>
-            <w:r>
-              <w:t>Near-silent</w:t>
-            </w:r>
-            <w:proofErr w:type="spellEnd"/>
-            <w:r>
-              <w:t xml:space="preserve"> </w:t>
-            </w:r>
-            <w:proofErr w:type="spellStart"/>
-            <w:r>
-              <w:t>operation</w:t>
-            </w:r>
-            <w:proofErr w:type="spellEnd"/>
-          </w:p>
-        </w:tc>
-      </w:tr>
-    </w:tbl>
-    <w:p/>
-    <w:p>
-      <w:pPr>
-        <w:pStyle w:val="Kop1"/>
-      </w:pPr>
-      <w:r>
-        <w:t>Control &amp; Communication</w:t>
-      </w:r>
-    </w:p>
-    <w:tbl>
-      <w:tblPr>
-        <w:tblStyle w:val="Tabelraster"/>
-        <w:tblW w:w="0" w:type="auto"/>
-        <w:tblLook w:val="04A0" w:firstRow="1" w:lastRow="0" w:firstColumn="1" w:lastColumn="0" w:noHBand="0" w:noVBand="1"/>
-      </w:tblPr>
-      <w:tblGrid>
-        <w:gridCol w:w="4508"/>
-        <w:gridCol w:w="4508"/>
-      </w:tblGrid>
-      <w:tr>
-        <w:tc>
-          <w:tcPr>
-            <w:tcW w:w="4513" w:type="dxa"/>
-          </w:tcPr>
-          <w:p>
-            <w:r>
-              <w:rPr>
-                <w:b/>
-              </w:rPr>
-              <w:t>Parameter</w:t>
-            </w:r>
-          </w:p>
-        </w:tc>
-        <w:tc>
-          <w:tcPr>
-            <w:tcW w:w="4513" w:type="dxa"/>
-          </w:tcPr>
-          <w:p>
-            <w:proofErr w:type="spellStart"/>
-            <w:r>
-              <w:rPr>
-                <w:b/>
-              </w:rPr>
-              <w:t>Specification</w:t>
-            </w:r>
-            <w:proofErr w:type="spellEnd"/>
-          </w:p>
-        </w:tc>
-      </w:tr>
-      <w:tr>
-        <w:tc>
-          <w:tcPr>
-            <w:tcW w:w="4513" w:type="dxa"/>
-          </w:tcPr>
-          <w:p>
-            <w:proofErr w:type="spellStart"/>
-            <w:r>
-              <w:t>Primary</w:t>
-            </w:r>
-            <w:proofErr w:type="spellEnd"/>
-            <w:r>
-              <w:t xml:space="preserve"> </w:t>
-            </w:r>
-            <w:proofErr w:type="spellStart"/>
-            <w:r>
-              <w:t>industrial</w:t>
-            </w:r>
-            <w:proofErr w:type="spellEnd"/>
-            <w:r>
-              <w:t xml:space="preserve"> protocol</w:t>
-            </w:r>
-          </w:p>
-        </w:tc>
-        <w:tc>
-          <w:tcPr>
-            <w:tcW w:w="4513" w:type="dxa"/>
-          </w:tcPr>
-          <w:p>
-            <w:pPr>
-              <w:rPr>
-                <w:lang w:val="en-US"/>
-              </w:rPr>
-            </w:pPr>
-            <w:r>
-              <w:rPr>
-                <w:lang w:val="en-US"/>
-              </w:rPr>
-              <w:t>Modbus TCP (via integrated gateway)</w:t>
-            </w:r>
-          </w:p>
-        </w:tc>
-      </w:tr>
-      <w:tr>
-        <w:tc>
-          <w:tcPr>
-            <w:tcW w:w="4513" w:type="dxa"/>
-          </w:tcPr>
-          <w:p>
-            <w:r>
-              <w:t xml:space="preserve">Module </w:t>
-            </w:r>
-            <w:proofErr w:type="spellStart"/>
-            <w:r>
-              <w:t>communication</w:t>
-            </w:r>
-            <w:proofErr w:type="spellEnd"/>
-          </w:p>
-        </w:tc>
-        <w:tc>
-          <w:tcPr>
-            <w:tcW w:w="4513" w:type="dxa"/>
-          </w:tcPr>
-          <w:p>
-            <w:r>
-              <w:t>CAN bus (</w:t>
-            </w:r>
-            <w:proofErr w:type="spellStart"/>
-            <w:r>
-              <w:t>internal</w:t>
-            </w:r>
-            <w:proofErr w:type="spellEnd"/>
-            <w:r>
-              <w:t>)</w:t>
-            </w:r>
-          </w:p>
-        </w:tc>
-      </w:tr>
-      <w:tr>
-        <w:tc>
-          <w:tcPr>
-            <w:tcW w:w="4513" w:type="dxa"/>
-          </w:tcPr>
-          <w:p>
-            <w:proofErr w:type="spellStart"/>
-            <w:r>
-              <w:t>Operation</w:t>
-            </w:r>
-            <w:proofErr w:type="spellEnd"/>
-          </w:p>
-        </w:tc>
-        <w:tc>
-          <w:tcPr>
-            <w:tcW w:w="4513" w:type="dxa"/>
-          </w:tcPr>
-          <w:p>
-            <w:pPr>
-              <w:rPr>
-                <w:lang w:val="en-US"/>
-              </w:rPr>
-            </w:pPr>
-            <w:r>
-              <w:rPr>
-                <w:lang w:val="en-US"/>
-              </w:rPr>
-              <w:t>Software grouping, master/slave current sharing</w:t>
-            </w:r>
-          </w:p>
-        </w:tc>
-      </w:tr>
-      <w:tr>
-        <w:tc>
-          <w:tcPr>
-            <w:tcW w:w="4513" w:type="dxa"/>
-          </w:tcPr>
-          <w:p>
-            <w:proofErr w:type="spellStart"/>
-            <w:r>
-              <w:t>Local</w:t>
-            </w:r>
-            <w:proofErr w:type="spellEnd"/>
-            <w:r>
-              <w:t xml:space="preserve"> interface</w:t>
-            </w:r>
-          </w:p>
-        </w:tc>
-        <w:tc>
-          <w:tcPr>
-            <w:tcW w:w="4513" w:type="dxa"/>
-          </w:tcPr>
-          <w:p>
-            <w:pPr>
-              <w:rPr>
-                <w:lang w:val="en-US"/>
-              </w:rPr>
-            </w:pPr>
-            <w:r>
-              <w:rPr>
-                <w:lang w:val="en-US"/>
-              </w:rPr>
-              <w:t>HMI LED display: voltage, current, group, address, mode, fault status</w:t>
-            </w:r>
-          </w:p>
-        </w:tc>
-      </w:tr>
-      <w:tr>
-        <w:tc>
-          <w:tcPr>
-            <w:tcW w:w="4513" w:type="dxa"/>
-          </w:tcPr>
-          <w:p>
-            <w:r>
-              <w:t>Remote update</w:t>
-            </w:r>
-          </w:p>
-        </w:tc>
-        <w:tc>
-          <w:tcPr>
-            <w:tcW w:w="4513" w:type="dxa"/>
-          </w:tcPr>
-          <w:p>
-            <w:r>
-              <w:t xml:space="preserve">OTA firmware upgrade </w:t>
-            </w:r>
-            <w:proofErr w:type="spellStart"/>
-            <w:r>
-              <w:t>supported</w:t>
-            </w:r>
-            <w:proofErr w:type="spellEnd"/>
-          </w:p>
-        </w:tc>
-      </w:tr>
-    </w:tbl>
-    <w:p/>
-    <w:p>
-      <w:pPr>
-        <w:pStyle w:val="Kop1"/>
-      </w:pPr>
-      <w:proofErr w:type="spellStart"/>
-      <w:r>
-        <w:t>Environmental</w:t>
-      </w:r>
-      <w:proofErr w:type="spellEnd"/>
-      <w:r>
-        <w:t xml:space="preserve"> &amp; </w:t>
-      </w:r>
-      <w:proofErr w:type="spellStart"/>
-      <w:r>
-        <w:t>Mechanical</w:t>
-      </w:r>
-      <w:proofErr w:type="spellEnd"/>
-    </w:p>
-    <w:tbl>
-      <w:tblPr>
-        <w:tblStyle w:val="Tabelraster"/>
-        <w:tblW w:w="0" w:type="auto"/>
-        <w:tblLook w:val="04A0" w:firstRow="1" w:lastRow="0" w:firstColumn="1" w:lastColumn="0" w:noHBand="0" w:noVBand="1"/>
-      </w:tblPr>
-      <w:tblGrid>
-        <w:gridCol w:w="4508"/>
-        <w:gridCol w:w="4508"/>
-      </w:tblGrid>
-      <w:tr>
-        <w:tc>
-          <w:tcPr>
-            <w:tcW w:w="4513" w:type="dxa"/>
-          </w:tcPr>
-          <w:p>
-            <w:r>
-              <w:rPr>
-                <w:b/>
-              </w:rPr>
-              <w:t>Parameter</w:t>
-            </w:r>
-          </w:p>
-        </w:tc>
-        <w:tc>
-          <w:tcPr>
-            <w:tcW w:w="4513" w:type="dxa"/>
-          </w:tcPr>
-          <w:p>
-            <w:proofErr w:type="spellStart"/>
-            <w:r>
-              <w:rPr>
-                <w:b/>
-              </w:rPr>
-              <w:t>Specification</w:t>
-            </w:r>
-            <w:proofErr w:type="spellEnd"/>
-          </w:p>
-        </w:tc>
-      </w:tr>
-      <w:tr>
-        <w:tc>
-          <w:tcPr>
-            <w:tcW w:w="4513" w:type="dxa"/>
-          </w:tcPr>
-          <w:p>
-            <w:r>
-              <w:t xml:space="preserve">Operating </w:t>
-            </w:r>
-            <w:proofErr w:type="spellStart"/>
-            <w:r>
-              <w:t>temperature</w:t>
-            </w:r>
-            <w:proofErr w:type="spellEnd"/>
-          </w:p>
-        </w:tc>
-        <w:tc>
-          <w:tcPr>
-            <w:tcW w:w="4513" w:type="dxa"/>
-          </w:tcPr>
-          <w:p>
-            <w:pPr>
-              <w:rPr>
-                <w:lang w:val="en-US"/>
-              </w:rPr>
-            </w:pPr>
-            <w:r>
-              <w:rPr>
-                <w:lang w:val="en-US"/>
-              </w:rPr>
-              <w:t>-40 C to +75 C (derates from +60 C)</w:t>
-            </w:r>
-          </w:p>
-        </w:tc>
-      </w:tr>
-      <w:tr>
-        <w:tc>
-          <w:tcPr>
-            <w:tcW w:w="4513" w:type="dxa"/>
-          </w:tcPr>
-          <w:p>
-            <w:r>
-              <w:t xml:space="preserve">Storage </w:t>
-            </w:r>
-            <w:proofErr w:type="spellStart"/>
-            <w:r>
-              <w:t>temperature</w:t>
-            </w:r>
-            <w:proofErr w:type="spellEnd"/>
-          </w:p>
-        </w:tc>
-        <w:tc>
-          <w:tcPr>
-            <w:tcW w:w="4513" w:type="dxa"/>
-          </w:tcPr>
-          <w:p>
-            <w:r>
-              <w:t xml:space="preserve">-40 C </w:t>
-            </w:r>
-            <w:proofErr w:type="spellStart"/>
-            <w:r>
-              <w:t>to</w:t>
-            </w:r>
-            <w:proofErr w:type="spellEnd"/>
-            <w:r>
-              <w:t xml:space="preserve"> +85 C</w:t>
-            </w:r>
-          </w:p>
-        </w:tc>
-      </w:tr>
-      <w:tr>
-        <w:tc>
-          <w:tcPr>
-            <w:tcW w:w="4513" w:type="dxa"/>
-          </w:tcPr>
-          <w:p>
-            <w:proofErr w:type="spellStart"/>
-            <w:r>
-              <w:t>Humidity</w:t>
-            </w:r>
-            <w:proofErr w:type="spellEnd"/>
-          </w:p>
-        </w:tc>
-        <w:tc>
-          <w:tcPr>
-            <w:tcW w:w="4513" w:type="dxa"/>
-          </w:tcPr>
-          <w:p>
-            <w:r>
-              <w:t>&lt;= 95 % RH, non-</w:t>
-            </w:r>
-            <w:proofErr w:type="spellStart"/>
-            <w:r>
-              <w:t>condensing</w:t>
-            </w:r>
-            <w:proofErr w:type="spellEnd"/>
-          </w:p>
-        </w:tc>
-      </w:tr>
-      <w:tr>
-        <w:tc>
-          <w:tcPr>
-            <w:tcW w:w="4513" w:type="dxa"/>
-          </w:tcPr>
-          <w:p>
-            <w:proofErr w:type="spellStart"/>
-            <w:r>
-              <w:t>Altitude</w:t>
-            </w:r>
-            <w:proofErr w:type="spellEnd"/>
-            <w:r>
-              <w:t xml:space="preserve"> / </w:t>
-            </w:r>
-            <w:proofErr w:type="spellStart"/>
-            <w:r>
-              <w:t>pressure</w:t>
-            </w:r>
-            <w:proofErr w:type="spellEnd"/>
-          </w:p>
-        </w:tc>
-        <w:tc>
-          <w:tcPr>
-            <w:tcW w:w="4513" w:type="dxa"/>
-          </w:tcPr>
-          <w:p>
-            <w:r>
-              <w:t xml:space="preserve">up </w:t>
-            </w:r>
-            <w:proofErr w:type="spellStart"/>
-            <w:r>
-              <w:t>to</w:t>
-            </w:r>
-            <w:proofErr w:type="spellEnd"/>
-            <w:r>
-              <w:t xml:space="preserve"> 2000 m / 79 - 110 kPa</w:t>
-            </w:r>
-          </w:p>
-        </w:tc>
-      </w:tr>
-      <w:tr>
-        <w:tc>
-          <w:tcPr>
-            <w:tcW w:w="4513" w:type="dxa"/>
-          </w:tcPr>
-          <w:p>
-            <w:proofErr w:type="spellStart"/>
-            <w:r>
-              <w:t>Protection</w:t>
-            </w:r>
-            <w:proofErr w:type="spellEnd"/>
-            <w:r>
-              <w:t xml:space="preserve"> rating (modules)</w:t>
-            </w:r>
-          </w:p>
-        </w:tc>
-        <w:tc>
-          <w:tcPr>
-            <w:tcW w:w="4513" w:type="dxa"/>
-          </w:tcPr>
-          <w:p>
-            <w:r>
-              <w:t>IP65</w:t>
-            </w:r>
-          </w:p>
-        </w:tc>
-      </w:tr>
-      <w:tr>
-        <w:tc>
-          <w:tcPr>
-            <w:tcW w:w="4513" w:type="dxa"/>
-          </w:tcPr>
-          <w:p>
-            <w:proofErr w:type="spellStart"/>
-            <w:r>
-              <w:t>Vibration</w:t>
-            </w:r>
-            <w:proofErr w:type="spellEnd"/>
-            <w:r>
-              <w:t xml:space="preserve"> / </w:t>
-            </w:r>
-            <w:proofErr w:type="spellStart"/>
-            <w:r>
-              <w:t>mobility</w:t>
-            </w:r>
-            <w:proofErr w:type="spellEnd"/>
-          </w:p>
-        </w:tc>
-        <w:tc>
-          <w:tcPr>
-            <w:tcW w:w="4513" w:type="dxa"/>
-          </w:tcPr>
-          <w:p>
-            <w:pPr>
-              <w:rPr>
-                <w:lang w:val="en-US"/>
-              </w:rPr>
-            </w:pPr>
-            <w:r>
-              <w:rPr>
-                <w:lang w:val="en-US"/>
-              </w:rPr>
-              <w:t>Suitable for mobile / vibration-exposed installations</w:t>
-            </w:r>
-          </w:p>
-        </w:tc>
-      </w:tr>
-      <w:tr>
-        <w:tc>
-          <w:tcPr>
-            <w:tcW w:w="4513" w:type="dxa"/>
-          </w:tcPr>
-          <w:p>
-            <w:proofErr w:type="spellStart"/>
-            <w:r>
-              <w:t>Serviceability</w:t>
-            </w:r>
-            <w:proofErr w:type="spellEnd"/>
-          </w:p>
-        </w:tc>
-        <w:tc>
-          <w:tcPr>
-            <w:tcW w:w="4513" w:type="dxa"/>
-          </w:tcPr>
-          <w:p>
-            <w:pPr>
-              <w:rPr>
-                <w:lang w:val="en-US"/>
-              </w:rPr>
-            </w:pPr>
-            <w:r>
-              <w:rPr>
-                <w:lang w:val="en-US"/>
-              </w:rPr>
-              <w:t>Hot-swappable modules; service without microgrid interruption</w:t>
-            </w:r>
-          </w:p>
-        </w:tc>
-      </w:tr>
-    </w:tbl>
-    <w:p>
-      <w:pPr>
-        <w:rPr>
-          <w:lang w:val="en-US"/>
-        </w:rPr>
-      </w:pPr>
-    </w:p>
-    <w:p>
-      <w:pPr>
-        <w:rPr>
-          <w:rFonts w:asciiTheme="majorHAnsi" w:eastAsiaTheme="majorEastAsia" w:hAnsiTheme="majorHAnsi" w:cstheme="majorBidi"/>
-          <w:color w:val="0F4761" w:themeColor="accent1" w:themeShade="BF"/>
-          <w:sz w:val="40"/>
-          <w:szCs w:val="40"/>
-        </w:rPr>
-      </w:pPr>
-      <w:r>
-        <w:br w:type="page"/>
-      </w:r>
-    </w:p>
-    <w:p>
-      <w:pPr>
-        <w:pStyle w:val="Kop1"/>
-      </w:pPr>
-      <w:r>
-        <w:lastRenderedPageBreak/>
-        <w:t>Compliance &amp; Safety</w:t>
-      </w:r>
-    </w:p>
-    <w:tbl>
-      <w:tblPr>
-        <w:tblStyle w:val="Tabelraster"/>
-        <w:tblW w:w="0" w:type="auto"/>
-        <w:tblLook w:val="04A0" w:firstRow="1" w:lastRow="0" w:firstColumn="1" w:lastColumn="0" w:noHBand="0" w:noVBand="1"/>
-      </w:tblPr>
-      <w:tblGrid>
-        <w:gridCol w:w="4508"/>
-        <w:gridCol w:w="4508"/>
-      </w:tblGrid>
-      <w:tr>
-        <w:tc>
-          <w:tcPr>
-            <w:tcW w:w="4513" w:type="dxa"/>
-          </w:tcPr>
-          <w:p>
-            <w:r>
-              <w:rPr>
-                <w:b/>
-              </w:rPr>
-              <w:t>Parameter</w:t>
-            </w:r>
-          </w:p>
-        </w:tc>
-        <w:tc>
-          <w:tcPr>
-            <w:tcW w:w="4513" w:type="dxa"/>
-          </w:tcPr>
-          <w:p>
-            <w:proofErr w:type="spellStart"/>
-            <w:r>
-              <w:rPr>
-                <w:b/>
-              </w:rPr>
-              <w:t>Specification</w:t>
-            </w:r>
-            <w:proofErr w:type="spellEnd"/>
-          </w:p>
-        </w:tc>
-      </w:tr>
-      <w:tr>
-        <w:tc>
-          <w:tcPr>
-            <w:tcW w:w="4513" w:type="dxa"/>
-          </w:tcPr>
-          <w:p>
-            <w:proofErr w:type="spellStart"/>
-            <w:r>
-              <w:t>Certification</w:t>
-            </w:r>
-            <w:proofErr w:type="spellEnd"/>
-          </w:p>
-        </w:tc>
-        <w:tc>
-          <w:tcPr>
-            <w:tcW w:w="4513" w:type="dxa"/>
-          </w:tcPr>
-          <w:p>
-            <w:r>
-              <w:t>CE</w:t>
-            </w:r>
-          </w:p>
-        </w:tc>
-      </w:tr>
-      <w:tr>
-        <w:tc>
-          <w:tcPr>
-            <w:tcW w:w="4513" w:type="dxa"/>
-          </w:tcPr>
-          <w:p>
-            <w:r>
-              <w:t xml:space="preserve">Installation </w:t>
-            </w:r>
-            <w:proofErr w:type="spellStart"/>
-            <w:r>
-              <w:t>standards</w:t>
-            </w:r>
-            <w:proofErr w:type="spellEnd"/>
-          </w:p>
-        </w:tc>
-        <w:tc>
-          <w:tcPr>
-            <w:tcW w:w="4513" w:type="dxa"/>
-          </w:tcPr>
-          <w:p>
-            <w:r>
-              <w:t>IEC 61439, NEN 1010</w:t>
-            </w:r>
-          </w:p>
-        </w:tc>
-      </w:tr>
-      <w:tr>
-        <w:tc>
-          <w:tcPr>
-            <w:tcW w:w="4513" w:type="dxa"/>
-          </w:tcPr>
-          <w:p>
-            <w:r>
-              <w:t>EMC</w:t>
-            </w:r>
-          </w:p>
-        </w:tc>
-        <w:tc>
-          <w:tcPr>
-            <w:tcW w:w="4513" w:type="dxa"/>
-          </w:tcPr>
-          <w:p>
-            <w:r>
-              <w:t>IEC 61000 (</w:t>
-            </w:r>
-            <w:proofErr w:type="spellStart"/>
-            <w:r>
-              <w:t>industrial</w:t>
-            </w:r>
-            <w:proofErr w:type="spellEnd"/>
-            <w:r>
-              <w:t>)</w:t>
-            </w:r>
-          </w:p>
-        </w:tc>
-      </w:tr>
-      <w:tr>
-        <w:tc>
-          <w:tcPr>
-            <w:tcW w:w="4513" w:type="dxa"/>
-          </w:tcPr>
-          <w:p>
-            <w:proofErr w:type="spellStart"/>
-            <w:r>
-              <w:t>Protection</w:t>
-            </w:r>
-            <w:proofErr w:type="spellEnd"/>
-            <w:r>
-              <w:t xml:space="preserve"> features</w:t>
-            </w:r>
-          </w:p>
-        </w:tc>
-        <w:tc>
-          <w:tcPr>
-            <w:tcW w:w="4513" w:type="dxa"/>
-          </w:tcPr>
-          <w:p>
-            <w:pPr>
-              <w:rPr>
-                <w:lang w:val="en-US"/>
-              </w:rPr>
-            </w:pPr>
-            <w:r>
-              <w:rPr>
-                <w:lang w:val="en-US"/>
-              </w:rPr>
-              <w:t>Battery back-feed protection - residual voltage discharge circuit - fault monitoring</w:t>
-            </w:r>
-          </w:p>
-        </w:tc>
-      </w:tr>
-      <w:tr>
-        <w:tc>
-          <w:tcPr>
-            <w:tcW w:w="4513" w:type="dxa"/>
-          </w:tcPr>
-          <w:p>
-            <w:r>
-              <w:t xml:space="preserve">System </w:t>
-            </w:r>
-            <w:proofErr w:type="spellStart"/>
-            <w:r>
-              <w:t>reliability</w:t>
-            </w:r>
-            <w:proofErr w:type="spellEnd"/>
-          </w:p>
-        </w:tc>
-        <w:tc>
-          <w:tcPr>
-            <w:tcW w:w="4513" w:type="dxa"/>
-          </w:tcPr>
-          <w:p>
-            <w:r>
-              <w:t>&gt; 98 % uptime (design target)</w:t>
-            </w:r>
-          </w:p>
-        </w:tc>
-      </w:tr>
-    </w:tbl>
-    <w:p/>
-    <w:p>
-      <w:pPr>
-        <w:rPr>
-          <w:lang w:val="en-US"/>
-        </w:rPr>
-      </w:pPr>
+      <w:pPr/>
       <w:r>
         <w:rPr>
           <w:i/>
-          <w:lang w:val="en-US"/>
         </w:rPr>
         <w:t>All values represent the complete 7-module system configuration. Specifications are indicative and subject to final confirmation and factory acceptance testing.</w:t>
       </w:r>
     </w:p>
     <w:sectPr>
-      <w:headerReference w:type="default" r:id="rId11"/>
-      <w:footerReference w:type="default" r:id="rId12"/>
-      <w:headerReference w:type="first" r:id="rId13"/>
-      <w:footerReference w:type="first" r:id="rId14"/>
+      <w:headerReference w:type="default" r:id="rId12"/>
+      <w:footerReference w:type="default" r:id="rId13"/>
+      <w:headerReference w:type="first" r:id="rId14"/>
+      <w:footerReference w:type="first" r:id="rId15"/>
       <w:pgSz w:w="11906" w:h="16838"/>
       <w:pgMar w:top="1440" w:right="1440" w:bottom="1440" w:left="1440" w:header="708" w:footer="708" w:gutter="0"/>
       <w:cols w:space="708"/>
@@ -2343,27 +1911,7 @@
               <w:szCs w:val="22"/>
               <w:lang w:val="nl-NL"/>
             </w:rPr>
-            <w:t xml:space="preserve">AC/DC </w:t>
-          </w:r>
-          <w:proofErr w:type="spellStart"/>
-          <w:r>
-            <w:rPr>
-              <w:b/>
-              <w:bCs/>
-              <w:szCs w:val="22"/>
-              <w:lang w:val="nl-NL"/>
-            </w:rPr>
-            <w:t>Charger</w:t>
-          </w:r>
-          <w:proofErr w:type="spellEnd"/>
-          <w:r>
-            <w:rPr>
-              <w:b/>
-              <w:bCs/>
-              <w:szCs w:val="22"/>
-              <w:lang w:val="nl-NL"/>
-            </w:rPr>
-            <w:t xml:space="preserve"> 400 A</w:t>
+            <w:t>AC/DC Charger 400 A</w:t>
           </w:r>
         </w:p>
       </w:tc>
@@ -2821,25 +2369,7 @@
               <w:szCs w:val="22"/>
               <w:lang w:val="nl-NL"/>
             </w:rPr>
-            <w:t xml:space="preserve">AC/DC </w:t>
-          </w:r>
-          <w:proofErr w:type="spellStart"/>
-          <w:r>
-            <w:rPr>
-              <w:rFonts w:cs="Arial"/>
-              <w:szCs w:val="22"/>
-              <w:lang w:val="nl-NL"/>
-            </w:rPr>
-            <w:t>Charger</w:t>
-          </w:r>
-          <w:proofErr w:type="spellEnd"/>
-          <w:r>
-            <w:rPr>
-              <w:rFonts w:cs="Arial"/>
-              <w:szCs w:val="22"/>
-              <w:lang w:val="nl-NL"/>
-            </w:rPr>
-            <w:t xml:space="preserve"> 400 A</w:t>
+            <w:t>AC/DC Charger 400 A</w:t>
           </w:r>
         </w:p>
       </w:tc>
@@ -6047,6 +5577,17 @@
 </file>
 
 <file path=customXml/item1.xml><?xml version="1.0" encoding="utf-8"?>
+<p:properties xmlns:p="http://schemas.microsoft.com/office/2006/metadata/properties" xmlns:xsi="http://www.w3.org/2001/XMLSchema-instance" xmlns:pc="http://schemas.microsoft.com/office/infopath/2007/PartnerControls">
+  <documentManagement>
+    <lcf76f155ced4ddcb4097134ff3c332f xmlns="bad3d67b-f193-448b-a744-3b18259562dc">
+      <Terms xmlns="http://schemas.microsoft.com/office/infopath/2007/PartnerControls"/>
+    </lcf76f155ced4ddcb4097134ff3c332f>
+    <TaxCatchAll xmlns="cda3afe3-35ba-4941-8550-7a5d5f0fe05e" xsi:nil="true"/>
+  </documentManagement>
+</p:properties>
+</file>
+
+<file path=customXml/item2.xml><?xml version="1.0" encoding="utf-8"?>
 <ct:contentTypeSchema xmlns:ct="http://schemas.microsoft.com/office/2006/metadata/contentType" xmlns:ma="http://schemas.microsoft.com/office/2006/metadata/properties/metaAttributes" ct:_="" ma:_="" ma:contentTypeName="Document" ma:contentTypeID="0x0101007958B8991735C043A6BDF9E43E778A38" ma:contentTypeVersion="13" ma:contentTypeDescription="Een nieuw document maken." ma:contentTypeScope="" ma:versionID="c92c20016d335409bac632710bc83f56">
   <xsd:schema xmlns:xsd="http://www.w3.org/2001/XMLSchema" xmlns:xs="http://www.w3.org/2001/XMLSchema" xmlns:p="http://schemas.microsoft.com/office/2006/metadata/properties" xmlns:ns2="bad3d67b-f193-448b-a744-3b18259562dc" xmlns:ns3="cda3afe3-35ba-4941-8550-7a5d5f0fe05e" targetNamespace="http://schemas.microsoft.com/office/2006/metadata/properties" ma:root="true" ma:fieldsID="d2f575b95444fefec373424d4c86c609" ns2:_="" ns3:_="">
     <xsd:import namespace="bad3d67b-f193-448b-a744-3b18259562dc"/>
@@ -6253,22 +5794,7 @@
 </ct:contentTypeSchema>
 </file>
 
-<file path=customXml/item2.xml><?xml version="1.0" encoding="utf-8"?>
-<p:properties xmlns:p="http://schemas.microsoft.com/office/2006/metadata/properties" xmlns:xsi="http://www.w3.org/2001/XMLSchema-instance" xmlns:pc="http://schemas.microsoft.com/office/infopath/2007/PartnerControls">
-  <documentManagement>
-    <lcf76f155ced4ddcb4097134ff3c332f xmlns="bad3d67b-f193-448b-a744-3b18259562dc">
-      <Terms xmlns="http://schemas.microsoft.com/office/infopath/2007/PartnerControls"/>
-    </lcf76f155ced4ddcb4097134ff3c332f>
-    <TaxCatchAll xmlns="cda3afe3-35ba-4941-8550-7a5d5f0fe05e" xsi:nil="true"/>
-  </documentManagement>
-</p:properties>
-</file>
-
 <file path=customXml/item3.xml><?xml version="1.0" encoding="utf-8"?>
-<b:Sources xmlns:b="http://schemas.openxmlformats.org/officeDocument/2006/bibliography" xmlns="http://schemas.openxmlformats.org/officeDocument/2006/bibliography" SelectedStyle="\APASixthEditionOfficeOnline.xsl" StyleName="APA" Version="6"/>
-</file>
-
-<file path=customXml/item4.xml><?xml version="1.0" encoding="utf-8"?>
 <?mso-contentType ?>
 <FormTemplates xmlns="http://schemas.microsoft.com/sharepoint/v3/contenttype/forms">
   <Display>DocumentLibraryForm</Display>
@@ -6277,7 +5803,22 @@
 </FormTemplates>
 </file>
 
+<file path=customXml/item4.xml><?xml version="1.0" encoding="utf-8"?>
+<b:Sources xmlns:b="http://schemas.openxmlformats.org/officeDocument/2006/bibliography" xmlns="http://schemas.openxmlformats.org/officeDocument/2006/bibliography" SelectedStyle="\APASixthEditionOfficeOnline.xsl" StyleName="APA" Version="6"/>
+</file>
+
 <file path=customXml/itemProps1.xml><?xml version="1.0" encoding="utf-8"?>
+<ds:datastoreItem xmlns:ds="http://schemas.openxmlformats.org/officeDocument/2006/customXml" ds:itemID="{127B758D-6A03-4528-AAE7-BEF91B036B0D}">
+  <ds:schemaRefs>
+    <ds:schemaRef ds:uri="http://schemas.microsoft.com/office/2006/metadata/properties"/>
+    <ds:schemaRef ds:uri="http://schemas.microsoft.com/office/infopath/2007/PartnerControls"/>
+    <ds:schemaRef ds:uri="bad3d67b-f193-448b-a744-3b18259562dc"/>
+    <ds:schemaRef ds:uri="cda3afe3-35ba-4941-8550-7a5d5f0fe05e"/>
+  </ds:schemaRefs>
+</ds:datastoreItem>
+</file>
+
+<file path=customXml/itemProps2.xml><?xml version="1.0" encoding="utf-8"?>
 <ds:datastoreItem xmlns:ds="http://schemas.openxmlformats.org/officeDocument/2006/customXml" ds:itemID="{E293EE7C-E0BA-46D9-83D3-E01986569BDD}">
   <ds:schemaRefs>
     <ds:schemaRef ds:uri="http://schemas.microsoft.com/office/2006/metadata/contentType"/>
@@ -6296,29 +5837,18 @@
 </ds:datastoreItem>
 </file>
 
-<file path=customXml/itemProps2.xml><?xml version="1.0" encoding="utf-8"?>
-<ds:datastoreItem xmlns:ds="http://schemas.openxmlformats.org/officeDocument/2006/customXml" ds:itemID="{127B758D-6A03-4528-AAE7-BEF91B036B0D}">
+<file path=customXml/itemProps3.xml><?xml version="1.0" encoding="utf-8"?>
+<ds:datastoreItem xmlns:ds="http://schemas.openxmlformats.org/officeDocument/2006/customXml" ds:itemID="{F5E1BF77-8178-4BA5-8B65-9AD2B699FC64}">
   <ds:schemaRefs>
-    <ds:schemaRef ds:uri="http://schemas.microsoft.com/office/2006/metadata/properties"/>
-    <ds:schemaRef ds:uri="http://schemas.microsoft.com/office/infopath/2007/PartnerControls"/>
-    <ds:schemaRef ds:uri="bad3d67b-f193-448b-a744-3b18259562dc"/>
-    <ds:schemaRef ds:uri="cda3afe3-35ba-4941-8550-7a5d5f0fe05e"/>
-  </ds:schemaRefs>
-</ds:datastoreItem>
-</file>
-
-<file path=customXml/itemProps3.xml><?xml version="1.0" encoding="utf-8"?>
-<ds:datastoreItem xmlns:ds="http://schemas.openxmlformats.org/officeDocument/2006/customXml" ds:itemID="{D38C4D8C-7A29-4EF5-951A-178AC2586D8A}">
-  <ds:schemaRefs>
-    <ds:schemaRef ds:uri="http://schemas.openxmlformats.org/officeDocument/2006/bibliography"/>
+    <ds:schemaRef ds:uri="http://schemas.microsoft.com/sharepoint/v3/contenttype/forms"/>
   </ds:schemaRefs>
 </ds:datastoreItem>
 </file>
 
 <file path=customXml/itemProps4.xml><?xml version="1.0" encoding="utf-8"?>
-<ds:datastoreItem xmlns:ds="http://schemas.openxmlformats.org/officeDocument/2006/customXml" ds:itemID="{F5E1BF77-8178-4BA5-8B65-9AD2B699FC64}">
+<ds:datastoreItem xmlns:ds="http://schemas.openxmlformats.org/officeDocument/2006/customXml" ds:itemID="{D38C4D8C-7A29-4EF5-951A-178AC2586D8A}">
   <ds:schemaRefs>
-    <ds:schemaRef ds:uri="http://schemas.microsoft.com/sharepoint/v3/contenttype/forms"/>
+    <ds:schemaRef ds:uri="http://schemas.openxmlformats.org/officeDocument/2006/bibliography"/>
   </ds:schemaRefs>
 </ds:datastoreItem>
 </file>

</xml_diff>